<commit_message>
IES-1642 - update RDM Publish Email text and PPRD Template
</commit_message>
<xml_diff>
--- a/GenBOE/PPRDTemplate.docx
+++ b/GenBOE/PPRDTemplate.docx
@@ -2,15 +2,15 @@
 <file path=word/document.xml><?xml version="1.0" encoding="utf-8"?>
 <w:document xmlns:wpc="http://schemas.microsoft.com/office/word/2010/wordprocessingCanvas" xmlns:cx="http://schemas.microsoft.com/office/drawing/2014/chartex" xmlns:cx1="http://schemas.microsoft.com/office/drawing/2015/9/8/chartex" xmlns:cx2="http://schemas.microsoft.com/office/drawing/2015/10/21/chartex" xmlns:cx3="http://schemas.microsoft.com/office/drawing/2016/5/9/chartex" xmlns:cx4="http://schemas.microsoft.com/office/drawing/2016/5/10/chartex" xmlns:cx5="http://schemas.microsoft.com/office/drawing/2016/5/11/chartex" xmlns:cx6="http://schemas.microsoft.com/office/drawing/2016/5/12/chartex" xmlns:cx7="http://schemas.microsoft.com/office/drawing/2016/5/13/chartex" xmlns:cx8="http://schemas.microsoft.com/office/drawing/2016/5/14/chartex" xmlns:mc="http://schemas.openxmlformats.org/markup-compatibility/2006" xmlns:aink="http://schemas.microsoft.com/office/drawing/2016/ink" xmlns:am3d="http://schemas.microsoft.com/office/drawing/2017/model3d" xmlns:o="urn:schemas-microsoft-com:office:office" xmlns:r="http://schemas.openxmlformats.org/officeDocument/2006/relationships" xmlns:m="http://schemas.openxmlformats.org/officeDocument/2006/math" xmlns:v="urn:schemas-microsoft-com:vml" xmlns:wp14="http://schemas.microsoft.com/office/word/2010/wordprocessingDrawing" xmlns:wp="http://schemas.openxmlformats.org/drawingml/2006/wordprocessingDrawing" xmlns:w10="urn:schemas-microsoft-com:office:word" xmlns:w="http://schemas.openxmlformats.org/wordprocessingml/2006/main" xmlns:w14="http://schemas.microsoft.com/office/word/2010/wordml" xmlns:w15="http://schemas.microsoft.com/office/word/2012/wordml" xmlns:w16cex="http://schemas.microsoft.com/office/word/2018/wordml/cex" xmlns:w16cid="http://schemas.microsoft.com/office/word/2016/wordml/cid" xmlns:w16="http://schemas.microsoft.com/office/word/2018/wordml" xmlns:w16sdtdh="http://schemas.microsoft.com/office/word/2020/wordml/sdtdatahash" xmlns:w16se="http://schemas.microsoft.com/office/word/2015/wordml/symex" xmlns:wpg="http://schemas.microsoft.com/office/word/2010/wordprocessingGroup" xmlns:wpi="http://schemas.microsoft.com/office/word/2010/wordprocessingInk" xmlns:wne="http://schemas.microsoft.com/office/word/2006/wordml" xmlns:wps="http://schemas.microsoft.com/office/word/2010/wordprocessingShape" mc:Ignorable="w14 w15 w16se w16cid w16 w16cex w16sdtdh wp14">
   <w:body>
-    <w:bookmarkStart w:id="0" w:name="_MON_1168698438" w:displacedByCustomXml="next"/>
+    <w:bookmarkStart w:id="0" w:name="_MON_1224926194" w:displacedByCustomXml="next"/>
     <w:bookmarkEnd w:id="0" w:displacedByCustomXml="next"/>
-    <w:bookmarkStart w:id="1" w:name="_MON_1016868660" w:displacedByCustomXml="next"/>
+    <w:bookmarkStart w:id="1" w:name="_MON_1016866627" w:displacedByCustomXml="next"/>
     <w:bookmarkEnd w:id="1" w:displacedByCustomXml="next"/>
     <w:bookmarkStart w:id="2" w:name="_MON_1016866703" w:displacedByCustomXml="next"/>
     <w:bookmarkEnd w:id="2" w:displacedByCustomXml="next"/>
-    <w:bookmarkStart w:id="3" w:name="_MON_1016866627" w:displacedByCustomXml="next"/>
+    <w:bookmarkStart w:id="3" w:name="_MON_1016868660" w:displacedByCustomXml="next"/>
     <w:bookmarkEnd w:id="3" w:displacedByCustomXml="next"/>
-    <w:bookmarkStart w:id="4" w:name="_MON_1224926194" w:displacedByCustomXml="next"/>
+    <w:bookmarkStart w:id="4" w:name="_MON_1168698438" w:displacedByCustomXml="next"/>
     <w:bookmarkEnd w:id="4" w:displacedByCustomXml="next"/>
     <w:sdt>
       <w:sdtPr>
@@ -32,8 +32,8 @@
         </w:rPr>
       </w:sdtEndPr>
       <w:sdtContent>
-        <w:bookmarkStart w:id="5" w:name="_MON_1169984582"/>
-        <w:bookmarkEnd w:id="5"/>
+        <w:bookmarkStart w:id="5" w:name="_MON_1169984582" w:displacedByCustomXml="prev"/>
+        <w:bookmarkEnd w:id="5" w:displacedByCustomXml="prev"/>
         <w:p>
           <w:pPr>
             <w:tabs>
@@ -73,10 +73,10 @@
                 <v:path o:extrusionok="f" gradientshapeok="t" o:connecttype="rect"/>
                 <o:lock v:ext="edit" aspectratio="t"/>
               </v:shapetype>
-              <v:shape id="_x0000_i1030" type="#_x0000_t75" style="width:330pt;height:66pt" o:ole="" fillcolor="window">
+              <v:shape id="_x0000_i1025" type="#_x0000_t75" style="width:330pt;height:66pt" o:ole="" fillcolor="window">
                 <v:imagedata r:id="rId8" o:title=""/>
               </v:shape>
-              <o:OLEObject Type="Embed" ProgID="Word.Picture.8" ShapeID="_x0000_i1030" DrawAspect="Content" ObjectID="_1716641069" r:id="rId9"/>
+              <o:OLEObject Type="Embed" ProgID="Word.Picture.8" ShapeID="_x0000_i1025" DrawAspect="Content" ObjectID="_1724065810" r:id="rId9"/>
             </w:object>
           </w:r>
         </w:p>
@@ -506,6 +506,19 @@
               <w:color w:val="0000FF"/>
             </w:rPr>
           </w:pPr>
+          <w:r>
+            <w:rPr>
+              <w:color w:val="0000FF"/>
+            </w:rPr>
+            <w:t>Program Contracts and Estimating are expected to review the revised PPR&amp;D in full and provide the appropriate disclosures for your CCOPD proposal(s) to your Contracting Officers.  Disclosable information may include data beyond rates and factors such as CAS, system status and Proposal Disclosures.  Please note that disclosure artifacts are to be kept in the Contracts file and tracked in the proposal disclosure log for proper records retention and audit purposes.</w:t>
+          </w:r>
+        </w:p>
+        <w:p>
+          <w:pPr>
+            <w:rPr>
+              <w:color w:val="0000FF"/>
+            </w:rPr>
+          </w:pPr>
         </w:p>
         <w:p>
           <w:pPr>
@@ -574,11 +587,21 @@
             </w:rPr>
             <w:fldChar w:fldCharType="separate"/>
           </w:r>
-          <w:fldSimple w:instr=" &quot;_Toc492553059&quot; ">
-            <w:r>
-              <w:t>Right click this text and select Update Field to generate and view the Table of Contents</w:t>
-            </w:r>
-          </w:fldSimple>
+          <w:r>
+            <w:fldChar w:fldCharType="begin"/>
+          </w:r>
+          <w:r>
+            <w:instrText xml:space="preserve"> "_Toc492553059" </w:instrText>
+          </w:r>
+          <w:r>
+            <w:fldChar w:fldCharType="separate"/>
+          </w:r>
+          <w:r>
+            <w:t>Right click this text and select Update Field to generate and view the Table of Contents</w:t>
+          </w:r>
+          <w:r>
+            <w:fldChar w:fldCharType="end"/>
+          </w:r>
         </w:p>
         <w:p>
           <w:pPr>
@@ -1315,15 +1338,6 @@
 <w:ftr xmlns:wpc="http://schemas.microsoft.com/office/word/2010/wordprocessingCanvas" xmlns:cx="http://schemas.microsoft.com/office/drawing/2014/chartex" xmlns:cx1="http://schemas.microsoft.com/office/drawing/2015/9/8/chartex" xmlns:cx2="http://schemas.microsoft.com/office/drawing/2015/10/21/chartex" xmlns:cx3="http://schemas.microsoft.com/office/drawing/2016/5/9/chartex" xmlns:cx4="http://schemas.microsoft.com/office/drawing/2016/5/10/chartex" xmlns:cx5="http://schemas.microsoft.com/office/drawing/2016/5/11/chartex" xmlns:cx6="http://schemas.microsoft.com/office/drawing/2016/5/12/chartex" xmlns:cx7="http://schemas.microsoft.com/office/drawing/2016/5/13/chartex" xmlns:cx8="http://schemas.microsoft.com/office/drawing/2016/5/14/chartex" xmlns:mc="http://schemas.openxmlformats.org/markup-compatibility/2006" xmlns:aink="http://schemas.microsoft.com/office/drawing/2016/ink" xmlns:am3d="http://schemas.microsoft.com/office/drawing/2017/model3d" xmlns:o="urn:schemas-microsoft-com:office:office" xmlns:r="http://schemas.openxmlformats.org/officeDocument/2006/relationships" xmlns:m="http://schemas.openxmlformats.org/officeDocument/2006/math" xmlns:v="urn:schemas-microsoft-com:vml" xmlns:wp14="http://schemas.microsoft.com/office/word/2010/wordprocessingDrawing" xmlns:wp="http://schemas.openxmlformats.org/drawingml/2006/wordprocessingDrawing" xmlns:w10="urn:schemas-microsoft-com:office:word" xmlns:w="http://schemas.openxmlformats.org/wordprocessingml/2006/main" xmlns:w14="http://schemas.microsoft.com/office/word/2010/wordml" xmlns:w15="http://schemas.microsoft.com/office/word/2012/wordml" xmlns:w16cex="http://schemas.microsoft.com/office/word/2018/wordml/cex" xmlns:w16cid="http://schemas.microsoft.com/office/word/2016/wordml/cid" xmlns:w16="http://schemas.microsoft.com/office/word/2018/wordml" xmlns:w16sdtdh="http://schemas.microsoft.com/office/word/2020/wordml/sdtdatahash" xmlns:w16se="http://schemas.microsoft.com/office/word/2015/wordml/symex" xmlns:wpg="http://schemas.microsoft.com/office/word/2010/wordprocessingGroup" xmlns:wpi="http://schemas.microsoft.com/office/word/2010/wordprocessingInk" xmlns:wne="http://schemas.microsoft.com/office/word/2006/wordml" xmlns:wps="http://schemas.microsoft.com/office/word/2010/wordprocessingShape" mc:Ignorable="w14 w15 w16se w16cid w16 w16cex w16sdtdh wp14">
   <w:p>
     <w:pPr>
-      <w:pStyle w:val="Footer"/>
-      <w:jc w:val="center"/>
-    </w:pPr>
-    <w:r>
-      <w:t>Lockheed Martin Proprietary Information</w:t>
-    </w:r>
-  </w:p>
-  <w:p>
-    <w:pPr>
       <w:tabs>
         <w:tab w:val="center" w:pos="4320"/>
         <w:tab w:val="right" w:pos="8640"/>
@@ -1430,15 +1444,6 @@
 
 <file path=word/header2.xml><?xml version="1.0" encoding="utf-8"?>
 <w:hdr xmlns:wpc="http://schemas.microsoft.com/office/word/2010/wordprocessingCanvas" xmlns:cx="http://schemas.microsoft.com/office/drawing/2014/chartex" xmlns:cx1="http://schemas.microsoft.com/office/drawing/2015/9/8/chartex" xmlns:cx2="http://schemas.microsoft.com/office/drawing/2015/10/21/chartex" xmlns:cx3="http://schemas.microsoft.com/office/drawing/2016/5/9/chartex" xmlns:cx4="http://schemas.microsoft.com/office/drawing/2016/5/10/chartex" xmlns:cx5="http://schemas.microsoft.com/office/drawing/2016/5/11/chartex" xmlns:cx6="http://schemas.microsoft.com/office/drawing/2016/5/12/chartex" xmlns:cx7="http://schemas.microsoft.com/office/drawing/2016/5/13/chartex" xmlns:cx8="http://schemas.microsoft.com/office/drawing/2016/5/14/chartex" xmlns:mc="http://schemas.openxmlformats.org/markup-compatibility/2006" xmlns:aink="http://schemas.microsoft.com/office/drawing/2016/ink" xmlns:am3d="http://schemas.microsoft.com/office/drawing/2017/model3d" xmlns:o="urn:schemas-microsoft-com:office:office" xmlns:r="http://schemas.openxmlformats.org/officeDocument/2006/relationships" xmlns:m="http://schemas.openxmlformats.org/officeDocument/2006/math" xmlns:v="urn:schemas-microsoft-com:vml" xmlns:wp14="http://schemas.microsoft.com/office/word/2010/wordprocessingDrawing" xmlns:wp="http://schemas.openxmlformats.org/drawingml/2006/wordprocessingDrawing" xmlns:w10="urn:schemas-microsoft-com:office:word" xmlns:w="http://schemas.openxmlformats.org/wordprocessingml/2006/main" xmlns:w14="http://schemas.microsoft.com/office/word/2010/wordml" xmlns:w15="http://schemas.microsoft.com/office/word/2012/wordml" xmlns:w16cex="http://schemas.microsoft.com/office/word/2018/wordml/cex" xmlns:w16cid="http://schemas.microsoft.com/office/word/2016/wordml/cid" xmlns:w16="http://schemas.microsoft.com/office/word/2018/wordml" xmlns:w16sdtdh="http://schemas.microsoft.com/office/word/2020/wordml/sdtdatahash" xmlns:w16se="http://schemas.microsoft.com/office/word/2015/wordml/symex" xmlns:wpg="http://schemas.microsoft.com/office/word/2010/wordprocessingGroup" xmlns:wpi="http://schemas.microsoft.com/office/word/2010/wordprocessingInk" xmlns:wne="http://schemas.microsoft.com/office/word/2006/wordml" xmlns:wps="http://schemas.microsoft.com/office/word/2010/wordprocessingShape" mc:Ignorable="w14 w15 w16se w16cid w16 w16cex w16sdtdh wp14">
-  <w:p>
-    <w:pPr>
-      <w:pStyle w:val="Footer"/>
-      <w:jc w:val="center"/>
-    </w:pPr>
-    <w:r>
-      <w:t>Lockheed Martin Proprietary Information</w:t>
-    </w:r>
-  </w:p>
   <w:p>
     <w:pPr>
       <w:tabs>
@@ -1936,6 +1941,7 @@
     <w:lsdException w:name="HTML Sample" w:semiHidden="1" w:unhideWhenUsed="1"/>
     <w:lsdException w:name="HTML Typewriter" w:semiHidden="1" w:unhideWhenUsed="1"/>
     <w:lsdException w:name="HTML Variable" w:semiHidden="1" w:unhideWhenUsed="1"/>
+    <w:lsdException w:name="Normal Table" w:semiHidden="1" w:unhideWhenUsed="1"/>
     <w:lsdException w:name="annotation subject" w:semiHidden="1" w:unhideWhenUsed="1"/>
     <w:lsdException w:name="No List" w:semiHidden="1" w:unhideWhenUsed="1"/>
     <w:lsdException w:name="Outline List 1" w:semiHidden="1" w:unhideWhenUsed="1"/>
@@ -1982,8 +1988,10 @@
     <w:lsdException w:name="Table Subtle 2" w:semiHidden="1" w:unhideWhenUsed="1"/>
     <w:lsdException w:name="Table Web 1" w:semiHidden="1" w:unhideWhenUsed="1"/>
     <w:lsdException w:name="Table Web 2" w:semiHidden="1" w:unhideWhenUsed="1"/>
+    <w:lsdException w:name="Table Web 3" w:semiHidden="1" w:unhideWhenUsed="1"/>
     <w:lsdException w:name="Balloon Text" w:semiHidden="1" w:unhideWhenUsed="1"/>
     <w:lsdException w:name="Table Grid" w:uiPriority="39"/>
+    <w:lsdException w:name="Table Theme" w:semiHidden="1" w:unhideWhenUsed="1"/>
     <w:lsdException w:name="Placeholder Text" w:semiHidden="1"/>
     <w:lsdException w:name="No Spacing" w:uiPriority="1" w:qFormat="1"/>
     <w:lsdException w:name="Light Shading" w:uiPriority="60"/>
@@ -2721,7 +2729,7 @@
       <w:docPartBody>
         <w:p>
           <w:pPr>
-            <w:pStyle w:val="C44BB59BDB064B8D90846BA766E001DA22"/>
+            <w:pStyle w:val="C44BB59BDB064B8D90846BA766E001DA"/>
           </w:pPr>
           <w:r>
             <w:rPr>
@@ -2752,7 +2760,7 @@
       <w:docPartBody>
         <w:p>
           <w:pPr>
-            <w:pStyle w:val="562D81866A7F4318B95320CC7802BE1222"/>
+            <w:pStyle w:val="562D81866A7F4318B95320CC7802BE12"/>
           </w:pPr>
           <w:r>
             <w:rPr>
@@ -2783,7 +2791,7 @@
       <w:docPartBody>
         <w:p>
           <w:pPr>
-            <w:pStyle w:val="81BA274595714D0293E02C289F4649F922"/>
+            <w:pStyle w:val="81BA274595714D0293E02C289F4649F9"/>
           </w:pPr>
           <w:r>
             <w:rPr>
@@ -2908,6 +2916,7 @@
     <w:rsid w:val="003E705E"/>
     <w:rsid w:val="003F274E"/>
     <w:rsid w:val="004349F2"/>
+    <w:rsid w:val="004361B3"/>
     <w:rsid w:val="004570C4"/>
     <w:rsid w:val="0049047F"/>
     <w:rsid w:val="004D51DC"/>
@@ -3153,6 +3162,7 @@
     <w:lsdException w:name="HTML Sample" w:semiHidden="1" w:unhideWhenUsed="1"/>
     <w:lsdException w:name="HTML Typewriter" w:semiHidden="1" w:unhideWhenUsed="1"/>
     <w:lsdException w:name="HTML Variable" w:semiHidden="1" w:unhideWhenUsed="1"/>
+    <w:lsdException w:name="Normal Table" w:semiHidden="1" w:unhideWhenUsed="1"/>
     <w:lsdException w:name="annotation subject" w:semiHidden="1" w:unhideWhenUsed="1"/>
     <w:lsdException w:name="No List" w:semiHidden="1" w:unhideWhenUsed="1"/>
     <w:lsdException w:name="Outline List 1" w:semiHidden="1" w:unhideWhenUsed="1"/>
@@ -3199,8 +3209,10 @@
     <w:lsdException w:name="Table Subtle 2" w:semiHidden="1" w:unhideWhenUsed="1"/>
     <w:lsdException w:name="Table Web 1" w:semiHidden="1" w:unhideWhenUsed="1"/>
     <w:lsdException w:name="Table Web 2" w:semiHidden="1" w:unhideWhenUsed="1"/>
+    <w:lsdException w:name="Table Web 3" w:semiHidden="1" w:unhideWhenUsed="1"/>
     <w:lsdException w:name="Balloon Text" w:semiHidden="1" w:unhideWhenUsed="1"/>
     <w:lsdException w:name="Table Grid" w:uiPriority="39"/>
+    <w:lsdException w:name="Table Theme" w:semiHidden="1" w:unhideWhenUsed="1"/>
     <w:lsdException w:name="Placeholder Text" w:semiHidden="1"/>
     <w:lsdException w:name="No Spacing" w:uiPriority="1" w:qFormat="1"/>
     <w:lsdException w:name="Light Shading" w:uiPriority="60"/>
@@ -3471,9 +3483,9 @@
     <w:name w:val="C5B9ECDE78F84E2A914E49DC8E87740D"/>
     <w:rsid w:val="005F2EEC"/>
   </w:style>
-  <w:style w:type="paragraph" w:customStyle="1" w:styleId="C44BB59BDB064B8D90846BA766E001DA22">
-    <w:name w:val="C44BB59BDB064B8D90846BA766E001DA22"/>
-    <w:rsid w:val="00F11DF1"/>
+  <w:style w:type="paragraph" w:customStyle="1" w:styleId="C44BB59BDB064B8D90846BA766E001DA">
+    <w:name w:val="C44BB59BDB064B8D90846BA766E001DA"/>
+    <w:rsid w:val="004361B3"/>
     <w:pPr>
       <w:spacing w:after="0"/>
     </w:pPr>
@@ -3482,9 +3494,9 @@
       <w:sz w:val="24"/>
     </w:rPr>
   </w:style>
-  <w:style w:type="paragraph" w:customStyle="1" w:styleId="562D81866A7F4318B95320CC7802BE1222">
-    <w:name w:val="562D81866A7F4318B95320CC7802BE1222"/>
-    <w:rsid w:val="00F11DF1"/>
+  <w:style w:type="paragraph" w:customStyle="1" w:styleId="562D81866A7F4318B95320CC7802BE12">
+    <w:name w:val="562D81866A7F4318B95320CC7802BE12"/>
+    <w:rsid w:val="004361B3"/>
     <w:pPr>
       <w:spacing w:after="0"/>
     </w:pPr>
@@ -3493,9 +3505,9 @@
       <w:sz w:val="24"/>
     </w:rPr>
   </w:style>
-  <w:style w:type="paragraph" w:customStyle="1" w:styleId="81BA274595714D0293E02C289F4649F922">
-    <w:name w:val="81BA274595714D0293E02C289F4649F922"/>
-    <w:rsid w:val="00F11DF1"/>
+  <w:style w:type="paragraph" w:customStyle="1" w:styleId="81BA274595714D0293E02C289F4649F9">
+    <w:name w:val="81BA274595714D0293E02C289F4649F9"/>
+    <w:rsid w:val="004361B3"/>
     <w:pPr>
       <w:spacing w:after="0"/>
     </w:pPr>

</xml_diff>

<commit_message>
Update real template and fix Project file
</commit_message>
<xml_diff>
--- a/GenBOE/PPRDTemplate.docx
+++ b/GenBOE/PPRDTemplate.docx
@@ -1,16 +1,16 @@
 
 <file path=word/document.xml><?xml version="1.0" encoding="utf-8"?>
-<w:document xmlns:wpc="http://schemas.microsoft.com/office/word/2010/wordprocessingCanvas" xmlns:cx="http://schemas.microsoft.com/office/drawing/2014/chartex" xmlns:cx1="http://schemas.microsoft.com/office/drawing/2015/9/8/chartex" xmlns:cx2="http://schemas.microsoft.com/office/drawing/2015/10/21/chartex" xmlns:cx3="http://schemas.microsoft.com/office/drawing/2016/5/9/chartex" xmlns:cx4="http://schemas.microsoft.com/office/drawing/2016/5/10/chartex" xmlns:cx5="http://schemas.microsoft.com/office/drawing/2016/5/11/chartex" xmlns:cx6="http://schemas.microsoft.com/office/drawing/2016/5/12/chartex" xmlns:cx7="http://schemas.microsoft.com/office/drawing/2016/5/13/chartex" xmlns:cx8="http://schemas.microsoft.com/office/drawing/2016/5/14/chartex" xmlns:mc="http://schemas.openxmlformats.org/markup-compatibility/2006" xmlns:aink="http://schemas.microsoft.com/office/drawing/2016/ink" xmlns:am3d="http://schemas.microsoft.com/office/drawing/2017/model3d" xmlns:o="urn:schemas-microsoft-com:office:office" xmlns:r="http://schemas.openxmlformats.org/officeDocument/2006/relationships" xmlns:m="http://schemas.openxmlformats.org/officeDocument/2006/math" xmlns:v="urn:schemas-microsoft-com:vml" xmlns:wp14="http://schemas.microsoft.com/office/word/2010/wordprocessingDrawing" xmlns:wp="http://schemas.openxmlformats.org/drawingml/2006/wordprocessingDrawing" xmlns:w10="urn:schemas-microsoft-com:office:word" xmlns:w="http://schemas.openxmlformats.org/wordprocessingml/2006/main" xmlns:w14="http://schemas.microsoft.com/office/word/2010/wordml" xmlns:w15="http://schemas.microsoft.com/office/word/2012/wordml" xmlns:w16cex="http://schemas.microsoft.com/office/word/2018/wordml/cex" xmlns:w16cid="http://schemas.microsoft.com/office/word/2016/wordml/cid" xmlns:w16="http://schemas.microsoft.com/office/word/2018/wordml" xmlns:w16sdtdh="http://schemas.microsoft.com/office/word/2020/wordml/sdtdatahash" xmlns:w16se="http://schemas.microsoft.com/office/word/2015/wordml/symex" xmlns:wpg="http://schemas.microsoft.com/office/word/2010/wordprocessingGroup" xmlns:wpi="http://schemas.microsoft.com/office/word/2010/wordprocessingInk" xmlns:wne="http://schemas.microsoft.com/office/word/2006/wordml" xmlns:wps="http://schemas.microsoft.com/office/word/2010/wordprocessingShape" mc:Ignorable="w14 w15 w16se w16cid w16 w16cex w16sdtdh wp14">
+<w:document xmlns:wpc="http://schemas.microsoft.com/office/word/2010/wordprocessingCanvas" xmlns:cx="http://schemas.microsoft.com/office/drawing/2014/chartex" xmlns:cx1="http://schemas.microsoft.com/office/drawing/2015/9/8/chartex" xmlns:cx2="http://schemas.microsoft.com/office/drawing/2015/10/21/chartex" xmlns:cx3="http://schemas.microsoft.com/office/drawing/2016/5/9/chartex" xmlns:cx4="http://schemas.microsoft.com/office/drawing/2016/5/10/chartex" xmlns:cx5="http://schemas.microsoft.com/office/drawing/2016/5/11/chartex" xmlns:cx6="http://schemas.microsoft.com/office/drawing/2016/5/12/chartex" xmlns:cx7="http://schemas.microsoft.com/office/drawing/2016/5/13/chartex" xmlns:cx8="http://schemas.microsoft.com/office/drawing/2016/5/14/chartex" xmlns:mc="http://schemas.openxmlformats.org/markup-compatibility/2006" xmlns:aink="http://schemas.microsoft.com/office/drawing/2016/ink" xmlns:am3d="http://schemas.microsoft.com/office/drawing/2017/model3d" xmlns:o="urn:schemas-microsoft-com:office:office" xmlns:oel="http://schemas.microsoft.com/office/2019/extlst" xmlns:r="http://schemas.openxmlformats.org/officeDocument/2006/relationships" xmlns:m="http://schemas.openxmlformats.org/officeDocument/2006/math" xmlns:v="urn:schemas-microsoft-com:vml" xmlns:wp14="http://schemas.microsoft.com/office/word/2010/wordprocessingDrawing" xmlns:wp="http://schemas.openxmlformats.org/drawingml/2006/wordprocessingDrawing" xmlns:w10="urn:schemas-microsoft-com:office:word" xmlns:w="http://schemas.openxmlformats.org/wordprocessingml/2006/main" xmlns:w14="http://schemas.microsoft.com/office/word/2010/wordml" xmlns:w15="http://schemas.microsoft.com/office/word/2012/wordml" xmlns:w16cex="http://schemas.microsoft.com/office/word/2018/wordml/cex" xmlns:w16cid="http://schemas.microsoft.com/office/word/2016/wordml/cid" xmlns:w16="http://schemas.microsoft.com/office/word/2018/wordml" xmlns:w16sdtdh="http://schemas.microsoft.com/office/word/2020/wordml/sdtdatahash" xmlns:w16se="http://schemas.microsoft.com/office/word/2015/wordml/symex" xmlns:wpg="http://schemas.microsoft.com/office/word/2010/wordprocessingGroup" xmlns:wpi="http://schemas.microsoft.com/office/word/2010/wordprocessingInk" xmlns:wne="http://schemas.microsoft.com/office/word/2006/wordml" xmlns:wps="http://schemas.microsoft.com/office/word/2010/wordprocessingShape" mc:Ignorable="w14 w15 w16se w16cid w16 w16cex w16sdtdh wp14">
   <w:body>
-    <w:bookmarkStart w:id="0" w:name="_MON_1224926194" w:displacedByCustomXml="next"/>
+    <w:bookmarkStart w:id="0" w:name="_MON_1168698438" w:displacedByCustomXml="next"/>
     <w:bookmarkEnd w:id="0" w:displacedByCustomXml="next"/>
-    <w:bookmarkStart w:id="1" w:name="_MON_1016866627" w:displacedByCustomXml="next"/>
+    <w:bookmarkStart w:id="1" w:name="_MON_1016868660" w:displacedByCustomXml="next"/>
     <w:bookmarkEnd w:id="1" w:displacedByCustomXml="next"/>
     <w:bookmarkStart w:id="2" w:name="_MON_1016866703" w:displacedByCustomXml="next"/>
     <w:bookmarkEnd w:id="2" w:displacedByCustomXml="next"/>
-    <w:bookmarkStart w:id="3" w:name="_MON_1016868660" w:displacedByCustomXml="next"/>
+    <w:bookmarkStart w:id="3" w:name="_MON_1016866627" w:displacedByCustomXml="next"/>
     <w:bookmarkEnd w:id="3" w:displacedByCustomXml="next"/>
-    <w:bookmarkStart w:id="4" w:name="_MON_1168698438" w:displacedByCustomXml="next"/>
+    <w:bookmarkStart w:id="4" w:name="_MON_1224926194" w:displacedByCustomXml="next"/>
     <w:bookmarkEnd w:id="4" w:displacedByCustomXml="next"/>
     <w:sdt>
       <w:sdtPr>
@@ -76,7 +76,7 @@
               <v:shape id="_x0000_i1025" type="#_x0000_t75" style="width:330pt;height:66pt" o:ole="" fillcolor="window">
                 <v:imagedata r:id="rId8" o:title=""/>
               </v:shape>
-              <o:OLEObject Type="Embed" ProgID="Word.Picture.8" ShapeID="_x0000_i1025" DrawAspect="Content" ObjectID="_1724065810" r:id="rId9"/>
+              <o:OLEObject Type="Embed" ProgID="Word.Picture.8" ShapeID="_x0000_i1025" DrawAspect="Content" ObjectID="_1759565041" r:id="rId9"/>
             </w:object>
           </w:r>
         </w:p>
@@ -159,11 +159,6 @@
               <w:docPart w:val="D60CAC68A73E4BBEBED5A0BEDA628DEE"/>
             </w:placeholder>
           </w:sdtPr>
-          <w:sdtEndPr>
-            <w:rPr>
-              <w:rStyle w:val="Style2Char"/>
-            </w:rPr>
-          </w:sdtEndPr>
           <w:sdtContent>
             <w:p>
               <w:pPr>
@@ -185,11 +180,6 @@
                     <w:docPart w:val="DefaultPlaceholder_-1854013440"/>
                   </w:placeholder>
                 </w:sdtPr>
-                <w:sdtEndPr>
-                  <w:rPr>
-                    <w:rStyle w:val="Style2Char"/>
-                  </w:rPr>
-                </w:sdtEndPr>
                 <w:sdtContent>
                   <w:r>
                     <w:rPr>
@@ -235,11 +225,6 @@
                     <w:docPart w:val="D60CAC68A73E4BBEBED5A0BEDA628DEE"/>
                   </w:placeholder>
                 </w:sdtPr>
-                <w:sdtEndPr>
-                  <w:rPr>
-                    <w:rStyle w:val="Style2Char"/>
-                  </w:rPr>
-                </w:sdtEndPr>
                 <w:sdtContent>
                   <w:r>
                     <w:rPr>
@@ -271,11 +256,6 @@
                     <w:docPart w:val="DefaultPlaceholder_-1854013440"/>
                   </w:placeholder>
                 </w:sdtPr>
-                <w:sdtEndPr>
-                  <w:rPr>
-                    <w:rStyle w:val="Style2Char"/>
-                  </w:rPr>
-                </w:sdtEndPr>
                 <w:sdtContent>
                   <w:r>
                     <w:rPr>
@@ -536,7 +516,21 @@
             <w:rPr>
               <w:color w:val="0000FF"/>
             </w:rPr>
-            <w:t>plicable), and ProPricer tables</w:t>
+            <w:t xml:space="preserve">plicable), and </w:t>
+          </w:r>
+          <w:proofErr w:type="spellStart"/>
+          <w:r>
+            <w:rPr>
+              <w:color w:val="0000FF"/>
+            </w:rPr>
+            <w:t>ProPricer</w:t>
+          </w:r>
+          <w:proofErr w:type="spellEnd"/>
+          <w:r>
+            <w:rPr>
+              <w:color w:val="0000FF"/>
+            </w:rPr>
+            <w:t xml:space="preserve"> tables</w:t>
           </w:r>
           <w:r>
             <w:rPr>
@@ -587,21 +581,11 @@
             </w:rPr>
             <w:fldChar w:fldCharType="separate"/>
           </w:r>
-          <w:r>
-            <w:fldChar w:fldCharType="begin"/>
-          </w:r>
-          <w:r>
-            <w:instrText xml:space="preserve"> "_Toc492553059" </w:instrText>
-          </w:r>
-          <w:r>
-            <w:fldChar w:fldCharType="separate"/>
-          </w:r>
-          <w:r>
-            <w:t>Right click this text and select Update Field to generate and view the Table of Contents</w:t>
-          </w:r>
-          <w:r>
-            <w:fldChar w:fldCharType="end"/>
-          </w:r>
+          <w:fldSimple w:instr=" &quot;_Toc492553059&quot; ">
+            <w:r>
+              <w:t>Right click this text and select Update Field to generate and view the Table of Contents</w:t>
+            </w:r>
+          </w:fldSimple>
         </w:p>
         <w:p>
           <w:pPr>
@@ -671,7 +655,6 @@
             </w:placeholder>
             <w:showingPlcHdr/>
           </w:sdtPr>
-          <w:sdtEndPr/>
           <w:sdtContent>
             <w:p>
               <w:pPr>
@@ -689,7 +672,6 @@
               <w:docPart w:val="DefaultPlaceholder_-1854013440"/>
             </w:placeholder>
           </w:sdtPr>
-          <w:sdtEndPr/>
           <w:sdtContent>
             <w:p>
               <w:pPr>
@@ -704,7 +686,6 @@
                     <w:docPart w:val="DefaultPlaceholder_-1854013440"/>
                   </w:placeholder>
                 </w:sdtPr>
-                <w:sdtEndPr/>
                 <w:sdtContent>
                   <w:r>
                     <w:t>Section</w:t>
@@ -732,7 +713,6 @@
                     <w:docPart w:val="DefaultPlaceholder_-1854013440"/>
                   </w:placeholder>
                 </w:sdtPr>
-                <w:sdtEndPr/>
                 <w:sdtContent>
                   <w:r>
                     <w:t>Section Title</w:t>
@@ -751,7 +731,6 @@
               <w:docPart w:val="DefaultPlaceholder_-1854013440"/>
             </w:placeholder>
           </w:sdtPr>
-          <w:sdtEndPr/>
           <w:sdtContent>
             <w:p>
               <w:pPr>
@@ -766,7 +745,6 @@
                     <w:docPart w:val="DefaultPlaceholder_-1854013440"/>
                   </w:placeholder>
                 </w:sdtPr>
-                <w:sdtEndPr/>
                 <w:sdtContent>
                   <w:r>
                     <w:t>Sub</w:t>
@@ -791,7 +769,6 @@
                     <w:docPart w:val="DefaultPlaceholder_-1854013440"/>
                   </w:placeholder>
                 </w:sdtPr>
-                <w:sdtEndPr/>
                 <w:sdtContent>
                   <w:r>
                     <w:t>Subsection Title</w:t>
@@ -810,7 +787,6 @@
               <w:docPart w:val="DefaultPlaceholder_-1854013440"/>
             </w:placeholder>
           </w:sdtPr>
-          <w:sdtEndPr/>
           <w:sdtContent>
             <w:p>
               <w:pPr>
@@ -825,7 +801,6 @@
                     <w:docPart w:val="DefaultPlaceholder_-1854013440"/>
                   </w:placeholder>
                 </w:sdtPr>
-                <w:sdtEndPr/>
                 <w:sdtContent>
                   <w:r>
                     <w:t>Subsubsection</w:t>
@@ -850,7 +825,6 @@
                     <w:docPart w:val="DefaultPlaceholder_-1854013440"/>
                   </w:placeholder>
                 </w:sdtPr>
-                <w:sdtEndPr/>
                 <w:sdtContent>
                   <w:r>
                     <w:t>Subsubsection Title</w:t>
@@ -873,7 +847,6 @@
               <w:docPart w:val="DefaultPlaceholder_-1854013440"/>
             </w:placeholder>
           </w:sdtPr>
-          <w:sdtEndPr/>
           <w:sdtContent>
             <w:sdt>
               <w:sdtPr>
@@ -888,7 +861,6 @@
                   <w:docPart w:val="DefaultPlaceholder_-1854013440"/>
                 </w:placeholder>
               </w:sdtPr>
-              <w:sdtEndPr/>
               <w:sdtContent>
                 <w:p>
                   <w:pPr>
@@ -909,6 +881,870 @@
                 </w:p>
               </w:sdtContent>
             </w:sdt>
+            <w:sdt>
+              <w:sdtPr>
+                <w:rPr>
+                  <w:rFonts w:cs="Times New Roman"/>
+                  <w:szCs w:val="24"/>
+                </w:rPr>
+                <w:alias w:val="AddressTable"/>
+                <w:tag w:val="AddressTable"/>
+                <w:id w:val="-146441443"/>
+                <w:placeholder>
+                  <w:docPart w:val="2D24977013E144B1B2424420B1277E29"/>
+                </w:placeholder>
+              </w:sdtPr>
+              <w:sdtEndPr>
+                <w:rPr>
+                  <w:sz w:val="20"/>
+                  <w:szCs w:val="20"/>
+                </w:rPr>
+              </w:sdtEndPr>
+              <w:sdtContent>
+                <w:p>
+                  <w:pPr>
+                    <w:spacing w:line="240" w:lineRule="auto"/>
+                    <w:contextualSpacing/>
+                    <w:rPr>
+                      <w:rFonts w:cs="Times New Roman"/>
+                      <w:szCs w:val="24"/>
+                    </w:rPr>
+                  </w:pPr>
+                </w:p>
+                <w:tbl>
+                  <w:tblPr>
+                    <w:tblStyle w:val="TableGrid"/>
+                    <w:tblW w:w="0" w:type="auto"/>
+                    <w:tblBorders>
+                      <w:top w:val="single" w:sz="12" w:space="0" w:color="auto"/>
+                      <w:left w:val="single" w:sz="12" w:space="0" w:color="auto"/>
+                      <w:bottom w:val="single" w:sz="6" w:space="0" w:color="auto"/>
+                      <w:right w:val="single" w:sz="6" w:space="0" w:color="auto"/>
+                      <w:insideH w:val="single" w:sz="6" w:space="0" w:color="auto"/>
+                      <w:insideV w:val="single" w:sz="6" w:space="0" w:color="auto"/>
+                    </w:tblBorders>
+                    <w:tblCellMar>
+                      <w:left w:w="72" w:type="dxa"/>
+                      <w:right w:w="72" w:type="dxa"/>
+                    </w:tblCellMar>
+                    <w:tblLook w:val="04A0" w:firstRow="1" w:lastRow="0" w:firstColumn="1" w:lastColumn="0" w:noHBand="0" w:noVBand="1"/>
+                  </w:tblPr>
+                  <w:tblGrid>
+                    <w:gridCol w:w="1800"/>
+                    <w:gridCol w:w="6388"/>
+                  </w:tblGrid>
+                  <w:tr>
+                    <w:trPr>
+                      <w:trHeight w:val="377"/>
+                    </w:trPr>
+                    <w:tc>
+                      <w:tcPr>
+                        <w:tcW w:w="1800" w:type="dxa"/>
+                        <w:tcBorders>
+                          <w:top w:val="single" w:sz="12" w:space="0" w:color="auto"/>
+                          <w:bottom w:val="single" w:sz="4" w:space="0" w:color="auto"/>
+                        </w:tcBorders>
+                        <w:shd w:val="clear" w:color="auto" w:fill="2F5496" w:themeFill="accent1" w:themeFillShade="BF"/>
+                        <w:vAlign w:val="center"/>
+                      </w:tcPr>
+                      <w:p>
+                        <w:pPr>
+                          <w:jc w:val="center"/>
+                          <w:rPr>
+                            <w:rFonts w:cs="Times New Roman"/>
+                            <w:b/>
+                            <w:color w:val="FFFFFF" w:themeColor="background1"/>
+                            <w:sz w:val="20"/>
+                            <w:szCs w:val="20"/>
+                          </w:rPr>
+                        </w:pPr>
+                        <w:r>
+                          <w:rPr>
+                            <w:rFonts w:cs="Times New Roman"/>
+                            <w:b/>
+                            <w:color w:val="FFFFFF" w:themeColor="background1"/>
+                            <w:sz w:val="20"/>
+                            <w:szCs w:val="20"/>
+                          </w:rPr>
+                          <w:t>Office</w:t>
+                        </w:r>
+                      </w:p>
+                    </w:tc>
+                    <w:sdt>
+                      <w:sdtPr>
+                        <w:rPr>
+                          <w:rFonts w:cs="Times New Roman"/>
+                          <w:sz w:val="20"/>
+                          <w:szCs w:val="20"/>
+                        </w:rPr>
+                        <w:alias w:val="AddressOffice"/>
+                        <w:tag w:val="AddressOffice"/>
+                        <w:id w:val="-1529012996"/>
+                        <w:placeholder>
+                          <w:docPart w:val="524EB1D2B6754F90A53D55EB4D357AAA"/>
+                        </w:placeholder>
+                        <w:showingPlcHdr/>
+                      </w:sdtPr>
+                      <w:sdtContent>
+                        <w:tc>
+                          <w:tcPr>
+                            <w:tcW w:w="6388" w:type="dxa"/>
+                            <w:tcBorders>
+                              <w:top w:val="single" w:sz="12" w:space="0" w:color="auto"/>
+                              <w:bottom w:val="single" w:sz="4" w:space="0" w:color="auto"/>
+                            </w:tcBorders>
+                            <w:shd w:val="clear" w:color="auto" w:fill="FFFFFF" w:themeFill="background1"/>
+                            <w:tcMar>
+                              <w:left w:w="115" w:type="dxa"/>
+                              <w:right w:w="115" w:type="dxa"/>
+                            </w:tcMar>
+                            <w:vAlign w:val="center"/>
+                          </w:tcPr>
+                          <w:p>
+                            <w:pPr>
+                              <w:rPr>
+                                <w:rFonts w:cs="Times New Roman"/>
+                                <w:b/>
+                                <w:color w:val="FFFFFF" w:themeColor="background1"/>
+                                <w:sz w:val="20"/>
+                                <w:szCs w:val="20"/>
+                              </w:rPr>
+                            </w:pPr>
+                            <w:r>
+                              <w:rPr>
+                                <w:rFonts w:cs="Times New Roman"/>
+                                <w:sz w:val="20"/>
+                                <w:szCs w:val="20"/>
+                              </w:rPr>
+                              <w:t>AddressOffice</w:t>
+                            </w:r>
+                          </w:p>
+                        </w:tc>
+                      </w:sdtContent>
+                    </w:sdt>
+                  </w:tr>
+                  <w:tr>
+                    <w:trPr>
+                      <w:trHeight w:val="377"/>
+                    </w:trPr>
+                    <w:tc>
+                      <w:tcPr>
+                        <w:tcW w:w="1800" w:type="dxa"/>
+                        <w:tcBorders>
+                          <w:top w:val="single" w:sz="4" w:space="0" w:color="auto"/>
+                          <w:bottom w:val="single" w:sz="6" w:space="0" w:color="auto"/>
+                        </w:tcBorders>
+                        <w:shd w:val="clear" w:color="auto" w:fill="2F5496" w:themeFill="accent1" w:themeFillShade="BF"/>
+                        <w:vAlign w:val="center"/>
+                      </w:tcPr>
+                      <w:p>
+                        <w:pPr>
+                          <w:jc w:val="center"/>
+                          <w:rPr>
+                            <w:rFonts w:cs="Times New Roman"/>
+                            <w:b/>
+                            <w:color w:val="FFFFFF" w:themeColor="background1"/>
+                            <w:sz w:val="20"/>
+                            <w:szCs w:val="20"/>
+                          </w:rPr>
+                        </w:pPr>
+                        <w:r>
+                          <w:rPr>
+                            <w:rFonts w:cs="Times New Roman"/>
+                            <w:b/>
+                            <w:color w:val="FFFFFF" w:themeColor="background1"/>
+                            <w:sz w:val="20"/>
+                            <w:szCs w:val="20"/>
+                          </w:rPr>
+                          <w:t>Agency</w:t>
+                        </w:r>
+                      </w:p>
+                    </w:tc>
+                    <w:sdt>
+                      <w:sdtPr>
+                        <w:rPr>
+                          <w:rFonts w:cs="Times New Roman"/>
+                          <w:sz w:val="20"/>
+                          <w:szCs w:val="20"/>
+                        </w:rPr>
+                        <w:alias w:val="AddressAgency"/>
+                        <w:tag w:val="AddressAgency"/>
+                        <w:id w:val="-1836531137"/>
+                        <w:placeholder>
+                          <w:docPart w:val="106044608F804B119A41E87BCC843A0A"/>
+                        </w:placeholder>
+                        <w:showingPlcHdr/>
+                      </w:sdtPr>
+                      <w:sdtContent>
+                        <w:tc>
+                          <w:tcPr>
+                            <w:tcW w:w="6388" w:type="dxa"/>
+                            <w:tcBorders>
+                              <w:top w:val="single" w:sz="4" w:space="0" w:color="auto"/>
+                              <w:bottom w:val="single" w:sz="4" w:space="0" w:color="auto"/>
+                            </w:tcBorders>
+                            <w:shd w:val="clear" w:color="auto" w:fill="FFFFFF" w:themeFill="background1"/>
+                            <w:tcMar>
+                              <w:left w:w="115" w:type="dxa"/>
+                              <w:right w:w="115" w:type="dxa"/>
+                            </w:tcMar>
+                            <w:vAlign w:val="center"/>
+                          </w:tcPr>
+                          <w:p>
+                            <w:pPr>
+                              <w:rPr>
+                                <w:rFonts w:cs="Times New Roman"/>
+                                <w:b/>
+                                <w:color w:val="FFFFFF" w:themeColor="background1"/>
+                                <w:sz w:val="20"/>
+                                <w:szCs w:val="20"/>
+                              </w:rPr>
+                            </w:pPr>
+                            <w:r>
+                              <w:rPr>
+                                <w:rFonts w:cs="Times New Roman"/>
+                                <w:sz w:val="20"/>
+                                <w:szCs w:val="20"/>
+                              </w:rPr>
+                              <w:t>AddressAgency</w:t>
+                            </w:r>
+                          </w:p>
+                        </w:tc>
+                      </w:sdtContent>
+                    </w:sdt>
+                  </w:tr>
+                  <w:tr>
+                    <w:trPr>
+                      <w:trHeight w:val="377"/>
+                    </w:trPr>
+                    <w:tc>
+                      <w:tcPr>
+                        <w:tcW w:w="1800" w:type="dxa"/>
+                        <w:tcBorders>
+                          <w:top w:val="single" w:sz="12" w:space="0" w:color="auto"/>
+                          <w:bottom w:val="single" w:sz="4" w:space="0" w:color="auto"/>
+                        </w:tcBorders>
+                        <w:shd w:val="clear" w:color="auto" w:fill="2F5496" w:themeFill="accent1" w:themeFillShade="BF"/>
+                        <w:vAlign w:val="center"/>
+                      </w:tcPr>
+                      <w:p>
+                        <w:pPr>
+                          <w:jc w:val="center"/>
+                          <w:rPr>
+                            <w:rFonts w:cs="Times New Roman"/>
+                            <w:b/>
+                            <w:color w:val="FFFFFF" w:themeColor="background1"/>
+                            <w:sz w:val="20"/>
+                            <w:szCs w:val="20"/>
+                          </w:rPr>
+                        </w:pPr>
+                        <w:r>
+                          <w:rPr>
+                            <w:rFonts w:cs="Times New Roman"/>
+                            <w:b/>
+                            <w:color w:val="FFFFFF" w:themeColor="background1"/>
+                            <w:sz w:val="20"/>
+                            <w:szCs w:val="20"/>
+                          </w:rPr>
+                          <w:t>LM BA</w:t>
+                        </w:r>
+                      </w:p>
+                    </w:tc>
+                    <w:sdt>
+                      <w:sdtPr>
+                        <w:rPr>
+                          <w:rFonts w:cs="Times New Roman"/>
+                          <w:sz w:val="20"/>
+                          <w:szCs w:val="20"/>
+                        </w:rPr>
+                        <w:alias w:val="AddressLMBA"/>
+                        <w:tag w:val="AddressLMBA"/>
+                        <w:id w:val="1836643789"/>
+                        <w:placeholder>
+                          <w:docPart w:val="3C11194AC35143F7B83F3E0FD2D5A02A"/>
+                        </w:placeholder>
+                        <w:showingPlcHdr/>
+                      </w:sdtPr>
+                      <w:sdtContent>
+                        <w:tc>
+                          <w:tcPr>
+                            <w:tcW w:w="6388" w:type="dxa"/>
+                            <w:tcBorders>
+                              <w:top w:val="single" w:sz="4" w:space="0" w:color="auto"/>
+                              <w:bottom w:val="single" w:sz="4" w:space="0" w:color="auto"/>
+                            </w:tcBorders>
+                            <w:shd w:val="clear" w:color="auto" w:fill="FFFFFF" w:themeFill="background1"/>
+                            <w:tcMar>
+                              <w:left w:w="115" w:type="dxa"/>
+                              <w:right w:w="115" w:type="dxa"/>
+                            </w:tcMar>
+                            <w:vAlign w:val="center"/>
+                          </w:tcPr>
+                          <w:p>
+                            <w:pPr>
+                              <w:rPr>
+                                <w:rFonts w:cs="Times New Roman"/>
+                                <w:b/>
+                                <w:color w:val="FFFFFF" w:themeColor="background1"/>
+                                <w:sz w:val="20"/>
+                                <w:szCs w:val="20"/>
+                              </w:rPr>
+                            </w:pPr>
+                            <w:r>
+                              <w:rPr>
+                                <w:rFonts w:cs="Times New Roman"/>
+                                <w:sz w:val="20"/>
+                                <w:szCs w:val="20"/>
+                              </w:rPr>
+                              <w:t>AddressLMBA</w:t>
+                            </w:r>
+                          </w:p>
+                        </w:tc>
+                      </w:sdtContent>
+                    </w:sdt>
+                  </w:tr>
+                  <w:tr>
+                    <w:trPr>
+                      <w:trHeight w:val="374"/>
+                    </w:trPr>
+                    <w:tc>
+                      <w:tcPr>
+                        <w:tcW w:w="1800" w:type="dxa"/>
+                        <w:tcBorders>
+                          <w:top w:val="single" w:sz="4" w:space="0" w:color="auto"/>
+                          <w:bottom w:val="single" w:sz="4" w:space="0" w:color="auto"/>
+                        </w:tcBorders>
+                        <w:shd w:val="clear" w:color="auto" w:fill="2F5496" w:themeFill="accent1" w:themeFillShade="BF"/>
+                        <w:vAlign w:val="center"/>
+                      </w:tcPr>
+                      <w:p>
+                        <w:pPr>
+                          <w:jc w:val="center"/>
+                          <w:rPr>
+                            <w:rFonts w:cs="Times New Roman"/>
+                            <w:b/>
+                            <w:color w:val="FFFFFF" w:themeColor="background1"/>
+                            <w:sz w:val="20"/>
+                            <w:szCs w:val="20"/>
+                          </w:rPr>
+                        </w:pPr>
+                        <w:r>
+                          <w:rPr>
+                            <w:rFonts w:cs="Times New Roman"/>
+                            <w:b/>
+                            <w:color w:val="FFFFFF" w:themeColor="background1"/>
+                            <w:sz w:val="20"/>
+                            <w:szCs w:val="20"/>
+                          </w:rPr>
+                          <w:t>Name</w:t>
+                        </w:r>
+                      </w:p>
+                    </w:tc>
+                    <w:sdt>
+                      <w:sdtPr>
+                        <w:rPr>
+                          <w:rFonts w:cs="Times New Roman"/>
+                          <w:sz w:val="20"/>
+                          <w:szCs w:val="20"/>
+                        </w:rPr>
+                        <w:alias w:val="AddressName"/>
+                        <w:tag w:val="AddressName"/>
+                        <w:id w:val="-1135171979"/>
+                        <w:placeholder>
+                          <w:docPart w:val="ECBD07DC464B4BB99A7B90CCF9A206F6"/>
+                        </w:placeholder>
+                        <w:showingPlcHdr/>
+                      </w:sdtPr>
+                      <w:sdtContent>
+                        <w:tc>
+                          <w:tcPr>
+                            <w:tcW w:w="6388" w:type="dxa"/>
+                            <w:tcBorders>
+                              <w:top w:val="single" w:sz="4" w:space="0" w:color="auto"/>
+                              <w:bottom w:val="single" w:sz="4" w:space="0" w:color="auto"/>
+                            </w:tcBorders>
+                            <w:shd w:val="clear" w:color="auto" w:fill="auto"/>
+                            <w:tcMar>
+                              <w:left w:w="115" w:type="dxa"/>
+                              <w:right w:w="115" w:type="dxa"/>
+                            </w:tcMar>
+                            <w:vAlign w:val="center"/>
+                          </w:tcPr>
+                          <w:p>
+                            <w:pPr>
+                              <w:rPr>
+                                <w:rFonts w:cs="Times New Roman"/>
+                                <w:b/>
+                                <w:color w:val="FFFFFF" w:themeColor="background1"/>
+                                <w:sz w:val="20"/>
+                                <w:szCs w:val="20"/>
+                              </w:rPr>
+                            </w:pPr>
+                            <w:r>
+                              <w:rPr>
+                                <w:rFonts w:cs="Times New Roman"/>
+                                <w:sz w:val="20"/>
+                                <w:szCs w:val="20"/>
+                              </w:rPr>
+                              <w:t>AddressName</w:t>
+                            </w:r>
+                          </w:p>
+                        </w:tc>
+                      </w:sdtContent>
+                    </w:sdt>
+                  </w:tr>
+                  <w:tr>
+                    <w:trPr>
+                      <w:trHeight w:val="374"/>
+                    </w:trPr>
+                    <w:tc>
+                      <w:tcPr>
+                        <w:tcW w:w="1800" w:type="dxa"/>
+                        <w:tcBorders>
+                          <w:top w:val="single" w:sz="4" w:space="0" w:color="auto"/>
+                          <w:bottom w:val="single" w:sz="6" w:space="0" w:color="auto"/>
+                        </w:tcBorders>
+                        <w:shd w:val="clear" w:color="auto" w:fill="2F5496" w:themeFill="accent1" w:themeFillShade="BF"/>
+                        <w:vAlign w:val="center"/>
+                      </w:tcPr>
+                      <w:p>
+                        <w:pPr>
+                          <w:jc w:val="center"/>
+                          <w:rPr>
+                            <w:rFonts w:cs="Times New Roman"/>
+                            <w:b/>
+                            <w:color w:val="FFFFFF" w:themeColor="background1"/>
+                            <w:sz w:val="20"/>
+                            <w:szCs w:val="20"/>
+                          </w:rPr>
+                        </w:pPr>
+                        <w:r>
+                          <w:rPr>
+                            <w:rFonts w:cs="Times New Roman"/>
+                            <w:b/>
+                            <w:color w:val="FFFFFF" w:themeColor="background1"/>
+                            <w:sz w:val="20"/>
+                            <w:szCs w:val="20"/>
+                          </w:rPr>
+                          <w:t>Street/</w:t>
+                        </w:r>
+                        <w:proofErr w:type="spellStart"/>
+                        <w:r>
+                          <w:rPr>
+                            <w:rFonts w:cs="Times New Roman"/>
+                            <w:b/>
+                            <w:color w:val="FFFFFF" w:themeColor="background1"/>
+                            <w:sz w:val="20"/>
+                            <w:szCs w:val="20"/>
+                          </w:rPr>
+                          <w:t>Bldg</w:t>
+                        </w:r>
+                        <w:proofErr w:type="spellEnd"/>
+                      </w:p>
+                    </w:tc>
+                    <w:tc>
+                      <w:tcPr>
+                        <w:tcW w:w="6388" w:type="dxa"/>
+                        <w:tcBorders>
+                          <w:top w:val="single" w:sz="4" w:space="0" w:color="auto"/>
+                          <w:bottom w:val="single" w:sz="6" w:space="0" w:color="auto"/>
+                        </w:tcBorders>
+                        <w:shd w:val="clear" w:color="auto" w:fill="FFFFFF" w:themeFill="background1"/>
+                        <w:tcMar>
+                          <w:left w:w="115" w:type="dxa"/>
+                          <w:right w:w="115" w:type="dxa"/>
+                        </w:tcMar>
+                        <w:vAlign w:val="center"/>
+                      </w:tcPr>
+                      <w:sdt>
+                        <w:sdtPr>
+                          <w:rPr>
+                            <w:rFonts w:cs="Times New Roman"/>
+                            <w:b/>
+                            <w:color w:val="FFFFFF" w:themeColor="background1"/>
+                            <w:sz w:val="20"/>
+                            <w:szCs w:val="20"/>
+                          </w:rPr>
+                          <w:alias w:val="AddressStreet"/>
+                          <w:tag w:val="AddressStreet"/>
+                          <w:id w:val="522983282"/>
+                          <w:placeholder>
+                            <w:docPart w:val="B3422A2DE8ED4EC3A6C7D602ED005408"/>
+                          </w:placeholder>
+                        </w:sdtPr>
+                        <w:sdtContent>
+                          <w:p>
+                            <w:pPr>
+                              <w:rPr>
+                                <w:rFonts w:cs="Times New Roman"/>
+                                <w:b/>
+                                <w:color w:val="FFFFFF" w:themeColor="background1"/>
+                                <w:sz w:val="20"/>
+                                <w:szCs w:val="20"/>
+                              </w:rPr>
+                            </w:pPr>
+                            <w:proofErr w:type="spellStart"/>
+                            <w:r>
+                              <w:rPr>
+                                <w:rFonts w:cs="Times New Roman"/>
+                                <w:sz w:val="20"/>
+                                <w:szCs w:val="20"/>
+                              </w:rPr>
+                              <w:t>AddressStreet</w:t>
+                            </w:r>
+                            <w:proofErr w:type="spellEnd"/>
+                            <w:r>
+                              <w:rPr>
+                                <w:rFonts w:cs="Times New Roman"/>
+                                <w:b/>
+                                <w:color w:val="FFFFFF" w:themeColor="background1"/>
+                                <w:sz w:val="20"/>
+                                <w:szCs w:val="20"/>
+                              </w:rPr>
+                              <w:t xml:space="preserve"> </w:t>
+                            </w:r>
+                          </w:p>
+                        </w:sdtContent>
+                      </w:sdt>
+                    </w:tc>
+                  </w:tr>
+                  <w:tr>
+                    <w:trPr>
+                      <w:trHeight w:val="374"/>
+                    </w:trPr>
+                    <w:tc>
+                      <w:tcPr>
+                        <w:tcW w:w="1800" w:type="dxa"/>
+                        <w:tcBorders>
+                          <w:top w:val="single" w:sz="6" w:space="0" w:color="auto"/>
+                          <w:bottom w:val="single" w:sz="6" w:space="0" w:color="auto"/>
+                        </w:tcBorders>
+                        <w:shd w:val="clear" w:color="auto" w:fill="2F5496" w:themeFill="accent1" w:themeFillShade="BF"/>
+                        <w:vAlign w:val="center"/>
+                      </w:tcPr>
+                      <w:p>
+                        <w:pPr>
+                          <w:jc w:val="center"/>
+                          <w:rPr>
+                            <w:rFonts w:cs="Times New Roman"/>
+                            <w:sz w:val="20"/>
+                            <w:szCs w:val="20"/>
+                          </w:rPr>
+                        </w:pPr>
+                        <w:r>
+                          <w:rPr>
+                            <w:rFonts w:cs="Times New Roman"/>
+                            <w:b/>
+                            <w:color w:val="FFFFFF" w:themeColor="background1"/>
+                            <w:sz w:val="20"/>
+                            <w:szCs w:val="20"/>
+                          </w:rPr>
+                          <w:t>City, ST</w:t>
+                        </w:r>
+                      </w:p>
+                    </w:tc>
+                    <w:sdt>
+                      <w:sdtPr>
+                        <w:rPr>
+                          <w:rFonts w:cs="Times New Roman"/>
+                          <w:sz w:val="20"/>
+                          <w:szCs w:val="20"/>
+                        </w:rPr>
+                        <w:alias w:val="AddressCity"/>
+                        <w:tag w:val="AddressCity"/>
+                        <w:id w:val="749940787"/>
+                        <w:placeholder>
+                          <w:docPart w:val="CF125363AD2F40A4A69E23CAC6E97C05"/>
+                        </w:placeholder>
+                        <w:showingPlcHdr/>
+                      </w:sdtPr>
+                      <w:sdtContent>
+                        <w:tc>
+                          <w:tcPr>
+                            <w:tcW w:w="6388" w:type="dxa"/>
+                            <w:tcBorders>
+                              <w:top w:val="single" w:sz="6" w:space="0" w:color="auto"/>
+                              <w:bottom w:val="single" w:sz="6" w:space="0" w:color="auto"/>
+                            </w:tcBorders>
+                            <w:vAlign w:val="center"/>
+                          </w:tcPr>
+                          <w:p>
+                            <w:pPr>
+                              <w:rPr>
+                                <w:rFonts w:cs="Times New Roman"/>
+                                <w:sz w:val="20"/>
+                                <w:szCs w:val="20"/>
+                              </w:rPr>
+                            </w:pPr>
+                            <w:r>
+                              <w:rPr>
+                                <w:rFonts w:cs="Times New Roman"/>
+                                <w:sz w:val="20"/>
+                                <w:szCs w:val="20"/>
+                              </w:rPr>
+                              <w:t>AddressCity</w:t>
+                            </w:r>
+                          </w:p>
+                        </w:tc>
+                      </w:sdtContent>
+                    </w:sdt>
+                  </w:tr>
+                  <w:tr>
+                    <w:trPr>
+                      <w:trHeight w:val="374"/>
+                    </w:trPr>
+                    <w:tc>
+                      <w:tcPr>
+                        <w:tcW w:w="1800" w:type="dxa"/>
+                        <w:tcBorders>
+                          <w:top w:val="single" w:sz="6" w:space="0" w:color="auto"/>
+                          <w:bottom w:val="single" w:sz="6" w:space="0" w:color="auto"/>
+                        </w:tcBorders>
+                        <w:shd w:val="clear" w:color="auto" w:fill="2F5496" w:themeFill="accent1" w:themeFillShade="BF"/>
+                        <w:vAlign w:val="center"/>
+                      </w:tcPr>
+                      <w:p>
+                        <w:pPr>
+                          <w:jc w:val="center"/>
+                          <w:rPr>
+                            <w:rFonts w:cs="Times New Roman"/>
+                            <w:sz w:val="20"/>
+                            <w:szCs w:val="20"/>
+                          </w:rPr>
+                        </w:pPr>
+                        <w:r>
+                          <w:rPr>
+                            <w:rFonts w:cs="Times New Roman"/>
+                            <w:b/>
+                            <w:color w:val="FFFFFF" w:themeColor="background1"/>
+                            <w:sz w:val="20"/>
+                            <w:szCs w:val="20"/>
+                          </w:rPr>
+                          <w:t>Phone</w:t>
+                        </w:r>
+                      </w:p>
+                    </w:tc>
+                    <w:sdt>
+                      <w:sdtPr>
+                        <w:rPr>
+                          <w:rFonts w:cs="Times New Roman"/>
+                          <w:sz w:val="20"/>
+                          <w:szCs w:val="20"/>
+                        </w:rPr>
+                        <w:alias w:val="AddressPhone"/>
+                        <w:tag w:val="AddressPhone"/>
+                        <w:id w:val="-1527633153"/>
+                        <w:placeholder>
+                          <w:docPart w:val="D662E4EE64784FE885BED988E369F631"/>
+                        </w:placeholder>
+                        <w:showingPlcHdr/>
+                      </w:sdtPr>
+                      <w:sdtContent>
+                        <w:tc>
+                          <w:tcPr>
+                            <w:tcW w:w="6388" w:type="dxa"/>
+                            <w:tcBorders>
+                              <w:top w:val="single" w:sz="6" w:space="0" w:color="auto"/>
+                              <w:bottom w:val="single" w:sz="6" w:space="0" w:color="auto"/>
+                            </w:tcBorders>
+                            <w:vAlign w:val="center"/>
+                          </w:tcPr>
+                          <w:p>
+                            <w:pPr>
+                              <w:rPr>
+                                <w:rFonts w:cs="Times New Roman"/>
+                                <w:sz w:val="20"/>
+                                <w:szCs w:val="20"/>
+                              </w:rPr>
+                            </w:pPr>
+                            <w:r>
+                              <w:rPr>
+                                <w:rFonts w:cs="Times New Roman"/>
+                                <w:sz w:val="20"/>
+                                <w:szCs w:val="20"/>
+                              </w:rPr>
+                              <w:t>AddressPhone</w:t>
+                            </w:r>
+                          </w:p>
+                        </w:tc>
+                      </w:sdtContent>
+                    </w:sdt>
+                  </w:tr>
+                  <w:tr>
+                    <w:trPr>
+                      <w:trHeight w:val="374"/>
+                    </w:trPr>
+                    <w:tc>
+                      <w:tcPr>
+                        <w:tcW w:w="1800" w:type="dxa"/>
+                        <w:tcBorders>
+                          <w:top w:val="single" w:sz="6" w:space="0" w:color="auto"/>
+                          <w:bottom w:val="single" w:sz="6" w:space="0" w:color="auto"/>
+                        </w:tcBorders>
+                        <w:shd w:val="clear" w:color="auto" w:fill="2F5496" w:themeFill="accent1" w:themeFillShade="BF"/>
+                        <w:vAlign w:val="center"/>
+                      </w:tcPr>
+                      <w:p>
+                        <w:pPr>
+                          <w:jc w:val="center"/>
+                          <w:rPr>
+                            <w:rFonts w:cs="Times New Roman"/>
+                            <w:sz w:val="20"/>
+                            <w:szCs w:val="20"/>
+                          </w:rPr>
+                        </w:pPr>
+                        <w:r>
+                          <w:rPr>
+                            <w:rFonts w:cs="Times New Roman"/>
+                            <w:b/>
+                            <w:color w:val="FFFFFF" w:themeColor="background1"/>
+                            <w:sz w:val="20"/>
+                            <w:szCs w:val="20"/>
+                          </w:rPr>
+                          <w:t>Email</w:t>
+                        </w:r>
+                      </w:p>
+                    </w:tc>
+                    <w:sdt>
+                      <w:sdtPr>
+                        <w:rPr>
+                          <w:rFonts w:cs="Times New Roman"/>
+                          <w:sz w:val="20"/>
+                          <w:szCs w:val="20"/>
+                        </w:rPr>
+                        <w:alias w:val="AddressEmail"/>
+                        <w:tag w:val="AddressEmail"/>
+                        <w:id w:val="-1108742205"/>
+                        <w:placeholder>
+                          <w:docPart w:val="8B7725C0C31041E9800165E89DAFAF2C"/>
+                        </w:placeholder>
+                        <w:showingPlcHdr/>
+                      </w:sdtPr>
+                      <w:sdtContent>
+                        <w:tc>
+                          <w:tcPr>
+                            <w:tcW w:w="6388" w:type="dxa"/>
+                            <w:tcBorders>
+                              <w:top w:val="single" w:sz="6" w:space="0" w:color="auto"/>
+                              <w:bottom w:val="single" w:sz="6" w:space="0" w:color="auto"/>
+                            </w:tcBorders>
+                            <w:vAlign w:val="center"/>
+                          </w:tcPr>
+                          <w:p>
+                            <w:pPr>
+                              <w:rPr>
+                                <w:rFonts w:cs="Times New Roman"/>
+                                <w:sz w:val="20"/>
+                                <w:szCs w:val="20"/>
+                              </w:rPr>
+                            </w:pPr>
+                            <w:r>
+                              <w:rPr>
+                                <w:rFonts w:cs="Times New Roman"/>
+                                <w:sz w:val="20"/>
+                                <w:szCs w:val="20"/>
+                              </w:rPr>
+                              <w:t>AddressEmail</w:t>
+                            </w:r>
+                          </w:p>
+                        </w:tc>
+                      </w:sdtContent>
+                    </w:sdt>
+                  </w:tr>
+                  <w:tr>
+                    <w:trPr>
+                      <w:trHeight w:val="374"/>
+                    </w:trPr>
+                    <w:tc>
+                      <w:tcPr>
+                        <w:tcW w:w="1800" w:type="dxa"/>
+                        <w:tcBorders>
+                          <w:top w:val="single" w:sz="6" w:space="0" w:color="auto"/>
+                          <w:bottom w:val="single" w:sz="6" w:space="0" w:color="auto"/>
+                        </w:tcBorders>
+                        <w:shd w:val="clear" w:color="auto" w:fill="2F5496" w:themeFill="accent1" w:themeFillShade="BF"/>
+                        <w:vAlign w:val="center"/>
+                      </w:tcPr>
+                      <w:p>
+                        <w:pPr>
+                          <w:jc w:val="center"/>
+                          <w:rPr>
+                            <w:rFonts w:cs="Times New Roman"/>
+                            <w:sz w:val="20"/>
+                            <w:szCs w:val="20"/>
+                          </w:rPr>
+                        </w:pPr>
+                        <w:r>
+                          <w:rPr>
+                            <w:rFonts w:cs="Times New Roman"/>
+                            <w:b/>
+                            <w:color w:val="FFFFFF" w:themeColor="background1"/>
+                            <w:sz w:val="20"/>
+                            <w:szCs w:val="20"/>
+                          </w:rPr>
+                          <w:t>Other</w:t>
+                        </w:r>
+                      </w:p>
+                    </w:tc>
+                    <w:tc>
+                      <w:tcPr>
+                        <w:tcW w:w="6388" w:type="dxa"/>
+                        <w:tcBorders>
+                          <w:top w:val="single" w:sz="6" w:space="0" w:color="auto"/>
+                          <w:bottom w:val="single" w:sz="6" w:space="0" w:color="auto"/>
+                        </w:tcBorders>
+                        <w:vAlign w:val="center"/>
+                      </w:tcPr>
+                      <w:p>
+                        <w:pPr>
+                          <w:rPr>
+                            <w:rFonts w:cs="Times New Roman"/>
+                            <w:sz w:val="20"/>
+                            <w:szCs w:val="20"/>
+                          </w:rPr>
+                        </w:pPr>
+                        <w:sdt>
+                          <w:sdtPr>
+                            <w:rPr>
+                              <w:rFonts w:cs="Times New Roman"/>
+                              <w:sz w:val="20"/>
+                              <w:szCs w:val="20"/>
+                            </w:rPr>
+                            <w:alias w:val="AddressOther"/>
+                            <w:tag w:val="AddressOther"/>
+                            <w:id w:val="1695815056"/>
+                            <w:placeholder>
+                              <w:docPart w:val="BA071C4D0DAE41CD80E7613325DA87C1"/>
+                            </w:placeholder>
+                            <w:showingPlcHdr/>
+                          </w:sdtPr>
+                          <w:sdtContent>
+                            <w:r>
+                              <w:rPr>
+                                <w:rFonts w:cs="Times New Roman"/>
+                                <w:sz w:val="20"/>
+                                <w:szCs w:val="20"/>
+                              </w:rPr>
+                              <w:t>AddressOther</w:t>
+                            </w:r>
+                          </w:sdtContent>
+                        </w:sdt>
+                      </w:p>
+                    </w:tc>
+                  </w:tr>
+                </w:tbl>
+              </w:sdtContent>
+            </w:sdt>
+            <w:p>
+              <w:pPr>
+                <w:spacing w:line="240" w:lineRule="auto"/>
+                <w:contextualSpacing/>
+                <w:rPr>
+                  <w:rFonts w:cs="Times New Roman"/>
+                  <w:szCs w:val="24"/>
+                </w:rPr>
+              </w:pPr>
+            </w:p>
             <w:sdt>
               <w:sdtPr>
                 <w:rPr>
@@ -992,7 +1828,6 @@
                             <w:docPart w:val="C5B9ECDE78F84E2A914E49DC8E87740D"/>
                           </w:placeholder>
                         </w:sdtPr>
-                        <w:sdtEndPr/>
                         <w:sdtContent>
                           <w:p>
                             <w:pPr>
@@ -1049,7 +1884,6 @@
                             <w:docPart w:val="C5B9ECDE78F84E2A914E49DC8E87740D"/>
                           </w:placeholder>
                         </w:sdtPr>
-                        <w:sdtEndPr/>
                         <w:sdtContent>
                           <w:p>
                             <w:pPr>
@@ -1102,7 +1936,6 @@
                             <w:docPart w:val="C5B9ECDE78F84E2A914E49DC8E87740D"/>
                           </w:placeholder>
                         </w:sdtPr>
-                        <w:sdtEndPr/>
                         <w:sdtContent>
                           <w:p>
                             <w:pPr>
@@ -1161,7 +1994,6 @@
                             </w:placeholder>
                             <w:showingPlcHdr/>
                           </w:sdtPr>
-                          <w:sdtEndPr/>
                           <w:sdtContent>
                             <w:r>
                               <w:rPr>
@@ -1190,7 +2022,6 @@
                         </w:placeholder>
                         <w:showingPlcHdr/>
                       </w:sdtPr>
-                      <w:sdtEndPr/>
                       <w:sdtContent>
                         <w:tc>
                           <w:tcPr>
@@ -1234,7 +2065,6 @@
                         </w:placeholder>
                         <w:showingPlcHdr/>
                       </w:sdtPr>
-                      <w:sdtEndPr/>
                       <w:sdtContent>
                         <w:tc>
                           <w:tcPr>
@@ -1279,10 +2109,129 @@
                 </w:rPr>
               </w:pPr>
             </w:p>
+            <w:p>
+              <w:pPr>
+                <w:spacing w:line="240" w:lineRule="auto"/>
+                <w:rPr>
+                  <w:rFonts w:cs="Times New Roman"/>
+                  <w:szCs w:val="24"/>
+                </w:rPr>
+              </w:pPr>
+            </w:p>
           </w:sdtContent>
         </w:sdt>
       </w:sdtContent>
     </w:sdt>
+    <w:p>
+      <w:pPr>
+        <w:spacing w:line="240" w:lineRule="auto"/>
+        <w:contextualSpacing/>
+      </w:pPr>
+    </w:p>
+    <w:p>
+      <w:pPr>
+        <w:spacing w:line="240" w:lineRule="auto"/>
+        <w:contextualSpacing/>
+      </w:pPr>
+    </w:p>
+    <w:p>
+      <w:pPr>
+        <w:spacing w:line="240" w:lineRule="auto"/>
+        <w:contextualSpacing/>
+      </w:pPr>
+    </w:p>
+    <w:p>
+      <w:pPr>
+        <w:spacing w:line="240" w:lineRule="auto"/>
+        <w:contextualSpacing/>
+      </w:pPr>
+    </w:p>
+    <w:p>
+      <w:pPr>
+        <w:spacing w:line="240" w:lineRule="auto"/>
+        <w:contextualSpacing/>
+      </w:pPr>
+    </w:p>
+    <w:p>
+      <w:pPr>
+        <w:spacing w:line="240" w:lineRule="auto"/>
+        <w:contextualSpacing/>
+      </w:pPr>
+    </w:p>
+    <w:p>
+      <w:pPr>
+        <w:spacing w:line="240" w:lineRule="auto"/>
+        <w:contextualSpacing/>
+      </w:pPr>
+    </w:p>
+    <w:p>
+      <w:pPr>
+        <w:spacing w:line="240" w:lineRule="auto"/>
+        <w:contextualSpacing/>
+      </w:pPr>
+    </w:p>
+    <w:p>
+      <w:pPr>
+        <w:spacing w:line="240" w:lineRule="auto"/>
+        <w:contextualSpacing/>
+      </w:pPr>
+    </w:p>
+    <w:p>
+      <w:pPr>
+        <w:spacing w:line="240" w:lineRule="auto"/>
+        <w:contextualSpacing/>
+      </w:pPr>
+    </w:p>
+    <w:p>
+      <w:pPr>
+        <w:spacing w:line="240" w:lineRule="auto"/>
+        <w:contextualSpacing/>
+      </w:pPr>
+    </w:p>
+    <w:p>
+      <w:pPr>
+        <w:spacing w:line="240" w:lineRule="auto"/>
+        <w:contextualSpacing/>
+      </w:pPr>
+    </w:p>
+    <w:p>
+      <w:pPr>
+        <w:spacing w:line="240" w:lineRule="auto"/>
+        <w:rPr>
+          <w:rFonts w:cs="Times New Roman"/>
+          <w:szCs w:val="24"/>
+        </w:rPr>
+      </w:pPr>
+    </w:p>
+    <w:p>
+      <w:pPr>
+        <w:spacing w:line="240" w:lineRule="auto"/>
+        <w:contextualSpacing/>
+      </w:pPr>
+    </w:p>
+    <w:p>
+      <w:pPr>
+        <w:spacing w:line="240" w:lineRule="auto"/>
+        <w:contextualSpacing/>
+      </w:pPr>
+    </w:p>
+    <w:p>
+      <w:pPr>
+        <w:spacing w:line="240" w:lineRule="auto"/>
+        <w:contextualSpacing/>
+      </w:pPr>
+    </w:p>
+    <w:p>
+      <w:pPr>
+        <w:spacing w:line="240" w:lineRule="auto"/>
+        <w:contextualSpacing/>
+        <w:rPr>
+          <w:rFonts w:ascii="Arial" w:hAnsi="Arial" w:cs="Arial"/>
+          <w:sz w:val="20"/>
+          <w:szCs w:val="20"/>
+        </w:rPr>
+      </w:pPr>
+    </w:p>
     <w:sectPr>
       <w:headerReference w:type="even" r:id="rId10"/>
       <w:headerReference w:type="default" r:id="rId11"/>
@@ -1300,7 +2249,7 @@
 </file>
 
 <file path=word/endnotes.xml><?xml version="1.0" encoding="utf-8"?>
-<w:endnotes xmlns:wpc="http://schemas.microsoft.com/office/word/2010/wordprocessingCanvas" xmlns:cx="http://schemas.microsoft.com/office/drawing/2014/chartex" xmlns:cx1="http://schemas.microsoft.com/office/drawing/2015/9/8/chartex" xmlns:cx2="http://schemas.microsoft.com/office/drawing/2015/10/21/chartex" xmlns:cx3="http://schemas.microsoft.com/office/drawing/2016/5/9/chartex" xmlns:cx4="http://schemas.microsoft.com/office/drawing/2016/5/10/chartex" xmlns:cx5="http://schemas.microsoft.com/office/drawing/2016/5/11/chartex" xmlns:cx6="http://schemas.microsoft.com/office/drawing/2016/5/12/chartex" xmlns:cx7="http://schemas.microsoft.com/office/drawing/2016/5/13/chartex" xmlns:cx8="http://schemas.microsoft.com/office/drawing/2016/5/14/chartex" xmlns:mc="http://schemas.openxmlformats.org/markup-compatibility/2006" xmlns:aink="http://schemas.microsoft.com/office/drawing/2016/ink" xmlns:am3d="http://schemas.microsoft.com/office/drawing/2017/model3d" xmlns:o="urn:schemas-microsoft-com:office:office" xmlns:r="http://schemas.openxmlformats.org/officeDocument/2006/relationships" xmlns:m="http://schemas.openxmlformats.org/officeDocument/2006/math" xmlns:v="urn:schemas-microsoft-com:vml" xmlns:wp14="http://schemas.microsoft.com/office/word/2010/wordprocessingDrawing" xmlns:wp="http://schemas.openxmlformats.org/drawingml/2006/wordprocessingDrawing" xmlns:w10="urn:schemas-microsoft-com:office:word" xmlns:w="http://schemas.openxmlformats.org/wordprocessingml/2006/main" xmlns:w14="http://schemas.microsoft.com/office/word/2010/wordml" xmlns:w15="http://schemas.microsoft.com/office/word/2012/wordml" xmlns:w16cex="http://schemas.microsoft.com/office/word/2018/wordml/cex" xmlns:w16cid="http://schemas.microsoft.com/office/word/2016/wordml/cid" xmlns:w16="http://schemas.microsoft.com/office/word/2018/wordml" xmlns:w16sdtdh="http://schemas.microsoft.com/office/word/2020/wordml/sdtdatahash" xmlns:w16se="http://schemas.microsoft.com/office/word/2015/wordml/symex" xmlns:wpg="http://schemas.microsoft.com/office/word/2010/wordprocessingGroup" xmlns:wpi="http://schemas.microsoft.com/office/word/2010/wordprocessingInk" xmlns:wne="http://schemas.microsoft.com/office/word/2006/wordml" xmlns:wps="http://schemas.microsoft.com/office/word/2010/wordprocessingShape" mc:Ignorable="w14 w15 w16se w16cid w16 w16cex w16sdtdh wp14">
+<w:endnotes xmlns:wpc="http://schemas.microsoft.com/office/word/2010/wordprocessingCanvas" xmlns:cx="http://schemas.microsoft.com/office/drawing/2014/chartex" xmlns:cx1="http://schemas.microsoft.com/office/drawing/2015/9/8/chartex" xmlns:cx2="http://schemas.microsoft.com/office/drawing/2015/10/21/chartex" xmlns:cx3="http://schemas.microsoft.com/office/drawing/2016/5/9/chartex" xmlns:cx4="http://schemas.microsoft.com/office/drawing/2016/5/10/chartex" xmlns:cx5="http://schemas.microsoft.com/office/drawing/2016/5/11/chartex" xmlns:cx6="http://schemas.microsoft.com/office/drawing/2016/5/12/chartex" xmlns:cx7="http://schemas.microsoft.com/office/drawing/2016/5/13/chartex" xmlns:cx8="http://schemas.microsoft.com/office/drawing/2016/5/14/chartex" xmlns:mc="http://schemas.openxmlformats.org/markup-compatibility/2006" xmlns:aink="http://schemas.microsoft.com/office/drawing/2016/ink" xmlns:am3d="http://schemas.microsoft.com/office/drawing/2017/model3d" xmlns:o="urn:schemas-microsoft-com:office:office" xmlns:oel="http://schemas.microsoft.com/office/2019/extlst" xmlns:r="http://schemas.openxmlformats.org/officeDocument/2006/relationships" xmlns:m="http://schemas.openxmlformats.org/officeDocument/2006/math" xmlns:v="urn:schemas-microsoft-com:vml" xmlns:wp14="http://schemas.microsoft.com/office/word/2010/wordprocessingDrawing" xmlns:wp="http://schemas.openxmlformats.org/drawingml/2006/wordprocessingDrawing" xmlns:w10="urn:schemas-microsoft-com:office:word" xmlns:w="http://schemas.openxmlformats.org/wordprocessingml/2006/main" xmlns:w14="http://schemas.microsoft.com/office/word/2010/wordml" xmlns:w15="http://schemas.microsoft.com/office/word/2012/wordml" xmlns:w16cex="http://schemas.microsoft.com/office/word/2018/wordml/cex" xmlns:w16cid="http://schemas.microsoft.com/office/word/2016/wordml/cid" xmlns:w16="http://schemas.microsoft.com/office/word/2018/wordml" xmlns:w16sdtdh="http://schemas.microsoft.com/office/word/2020/wordml/sdtdatahash" xmlns:w16se="http://schemas.microsoft.com/office/word/2015/wordml/symex" xmlns:wpg="http://schemas.microsoft.com/office/word/2010/wordprocessingGroup" xmlns:wpi="http://schemas.microsoft.com/office/word/2010/wordprocessingInk" xmlns:wne="http://schemas.microsoft.com/office/word/2006/wordml" xmlns:wps="http://schemas.microsoft.com/office/word/2010/wordprocessingShape" mc:Ignorable="w14 w15 w16se w16cid w16 w16cex w16sdtdh wp14">
   <w:endnote w:type="separator" w:id="-1">
     <w:p>
       <w:pPr>
@@ -1325,7 +2274,7 @@
 </file>
 
 <file path=word/footer1.xml><?xml version="1.0" encoding="utf-8"?>
-<w:ftr xmlns:wpc="http://schemas.microsoft.com/office/word/2010/wordprocessingCanvas" xmlns:cx="http://schemas.microsoft.com/office/drawing/2014/chartex" xmlns:cx1="http://schemas.microsoft.com/office/drawing/2015/9/8/chartex" xmlns:cx2="http://schemas.microsoft.com/office/drawing/2015/10/21/chartex" xmlns:cx3="http://schemas.microsoft.com/office/drawing/2016/5/9/chartex" xmlns:cx4="http://schemas.microsoft.com/office/drawing/2016/5/10/chartex" xmlns:cx5="http://schemas.microsoft.com/office/drawing/2016/5/11/chartex" xmlns:cx6="http://schemas.microsoft.com/office/drawing/2016/5/12/chartex" xmlns:cx7="http://schemas.microsoft.com/office/drawing/2016/5/13/chartex" xmlns:cx8="http://schemas.microsoft.com/office/drawing/2016/5/14/chartex" xmlns:mc="http://schemas.openxmlformats.org/markup-compatibility/2006" xmlns:aink="http://schemas.microsoft.com/office/drawing/2016/ink" xmlns:am3d="http://schemas.microsoft.com/office/drawing/2017/model3d" xmlns:o="urn:schemas-microsoft-com:office:office" xmlns:r="http://schemas.openxmlformats.org/officeDocument/2006/relationships" xmlns:m="http://schemas.openxmlformats.org/officeDocument/2006/math" xmlns:v="urn:schemas-microsoft-com:vml" xmlns:wp14="http://schemas.microsoft.com/office/word/2010/wordprocessingDrawing" xmlns:wp="http://schemas.openxmlformats.org/drawingml/2006/wordprocessingDrawing" xmlns:w10="urn:schemas-microsoft-com:office:word" xmlns:w="http://schemas.openxmlformats.org/wordprocessingml/2006/main" xmlns:w14="http://schemas.microsoft.com/office/word/2010/wordml" xmlns:w15="http://schemas.microsoft.com/office/word/2012/wordml" xmlns:w16cex="http://schemas.microsoft.com/office/word/2018/wordml/cex" xmlns:w16cid="http://schemas.microsoft.com/office/word/2016/wordml/cid" xmlns:w16="http://schemas.microsoft.com/office/word/2018/wordml" xmlns:w16sdtdh="http://schemas.microsoft.com/office/word/2020/wordml/sdtdatahash" xmlns:w16se="http://schemas.microsoft.com/office/word/2015/wordml/symex" xmlns:wpg="http://schemas.microsoft.com/office/word/2010/wordprocessingGroup" xmlns:wpi="http://schemas.microsoft.com/office/word/2010/wordprocessingInk" xmlns:wne="http://schemas.microsoft.com/office/word/2006/wordml" xmlns:wps="http://schemas.microsoft.com/office/word/2010/wordprocessingShape" mc:Ignorable="w14 w15 w16se w16cid w16 w16cex w16sdtdh wp14">
+<w:ftr xmlns:wpc="http://schemas.microsoft.com/office/word/2010/wordprocessingCanvas" xmlns:cx="http://schemas.microsoft.com/office/drawing/2014/chartex" xmlns:cx1="http://schemas.microsoft.com/office/drawing/2015/9/8/chartex" xmlns:cx2="http://schemas.microsoft.com/office/drawing/2015/10/21/chartex" xmlns:cx3="http://schemas.microsoft.com/office/drawing/2016/5/9/chartex" xmlns:cx4="http://schemas.microsoft.com/office/drawing/2016/5/10/chartex" xmlns:cx5="http://schemas.microsoft.com/office/drawing/2016/5/11/chartex" xmlns:cx6="http://schemas.microsoft.com/office/drawing/2016/5/12/chartex" xmlns:cx7="http://schemas.microsoft.com/office/drawing/2016/5/13/chartex" xmlns:cx8="http://schemas.microsoft.com/office/drawing/2016/5/14/chartex" xmlns:mc="http://schemas.openxmlformats.org/markup-compatibility/2006" xmlns:aink="http://schemas.microsoft.com/office/drawing/2016/ink" xmlns:am3d="http://schemas.microsoft.com/office/drawing/2017/model3d" xmlns:o="urn:schemas-microsoft-com:office:office" xmlns:oel="http://schemas.microsoft.com/office/2019/extlst" xmlns:r="http://schemas.openxmlformats.org/officeDocument/2006/relationships" xmlns:m="http://schemas.openxmlformats.org/officeDocument/2006/math" xmlns:v="urn:schemas-microsoft-com:vml" xmlns:wp14="http://schemas.microsoft.com/office/word/2010/wordprocessingDrawing" xmlns:wp="http://schemas.openxmlformats.org/drawingml/2006/wordprocessingDrawing" xmlns:w10="urn:schemas-microsoft-com:office:word" xmlns:w="http://schemas.openxmlformats.org/wordprocessingml/2006/main" xmlns:w14="http://schemas.microsoft.com/office/word/2010/wordml" xmlns:w15="http://schemas.microsoft.com/office/word/2012/wordml" xmlns:w16cex="http://schemas.microsoft.com/office/word/2018/wordml/cex" xmlns:w16cid="http://schemas.microsoft.com/office/word/2016/wordml/cid" xmlns:w16="http://schemas.microsoft.com/office/word/2018/wordml" xmlns:w16sdtdh="http://schemas.microsoft.com/office/word/2020/wordml/sdtdatahash" xmlns:w16se="http://schemas.microsoft.com/office/word/2015/wordml/symex" xmlns:wpg="http://schemas.microsoft.com/office/word/2010/wordprocessingGroup" xmlns:wpi="http://schemas.microsoft.com/office/word/2010/wordprocessingInk" xmlns:wne="http://schemas.microsoft.com/office/word/2006/wordml" xmlns:wps="http://schemas.microsoft.com/office/word/2010/wordprocessingShape" mc:Ignorable="w14 w15 w16se w16cid w16 w16cex w16sdtdh wp14">
   <w:p>
     <w:pPr>
       <w:pStyle w:val="Footer"/>
@@ -1335,7 +2284,7 @@
 </file>
 
 <file path=word/footer2.xml><?xml version="1.0" encoding="utf-8"?>
-<w:ftr xmlns:wpc="http://schemas.microsoft.com/office/word/2010/wordprocessingCanvas" xmlns:cx="http://schemas.microsoft.com/office/drawing/2014/chartex" xmlns:cx1="http://schemas.microsoft.com/office/drawing/2015/9/8/chartex" xmlns:cx2="http://schemas.microsoft.com/office/drawing/2015/10/21/chartex" xmlns:cx3="http://schemas.microsoft.com/office/drawing/2016/5/9/chartex" xmlns:cx4="http://schemas.microsoft.com/office/drawing/2016/5/10/chartex" xmlns:cx5="http://schemas.microsoft.com/office/drawing/2016/5/11/chartex" xmlns:cx6="http://schemas.microsoft.com/office/drawing/2016/5/12/chartex" xmlns:cx7="http://schemas.microsoft.com/office/drawing/2016/5/13/chartex" xmlns:cx8="http://schemas.microsoft.com/office/drawing/2016/5/14/chartex" xmlns:mc="http://schemas.openxmlformats.org/markup-compatibility/2006" xmlns:aink="http://schemas.microsoft.com/office/drawing/2016/ink" xmlns:am3d="http://schemas.microsoft.com/office/drawing/2017/model3d" xmlns:o="urn:schemas-microsoft-com:office:office" xmlns:r="http://schemas.openxmlformats.org/officeDocument/2006/relationships" xmlns:m="http://schemas.openxmlformats.org/officeDocument/2006/math" xmlns:v="urn:schemas-microsoft-com:vml" xmlns:wp14="http://schemas.microsoft.com/office/word/2010/wordprocessingDrawing" xmlns:wp="http://schemas.openxmlformats.org/drawingml/2006/wordprocessingDrawing" xmlns:w10="urn:schemas-microsoft-com:office:word" xmlns:w="http://schemas.openxmlformats.org/wordprocessingml/2006/main" xmlns:w14="http://schemas.microsoft.com/office/word/2010/wordml" xmlns:w15="http://schemas.microsoft.com/office/word/2012/wordml" xmlns:w16cex="http://schemas.microsoft.com/office/word/2018/wordml/cex" xmlns:w16cid="http://schemas.microsoft.com/office/word/2016/wordml/cid" xmlns:w16="http://schemas.microsoft.com/office/word/2018/wordml" xmlns:w16sdtdh="http://schemas.microsoft.com/office/word/2020/wordml/sdtdatahash" xmlns:w16se="http://schemas.microsoft.com/office/word/2015/wordml/symex" xmlns:wpg="http://schemas.microsoft.com/office/word/2010/wordprocessingGroup" xmlns:wpi="http://schemas.microsoft.com/office/word/2010/wordprocessingInk" xmlns:wne="http://schemas.microsoft.com/office/word/2006/wordml" xmlns:wps="http://schemas.microsoft.com/office/word/2010/wordprocessingShape" mc:Ignorable="w14 w15 w16se w16cid w16 w16cex w16sdtdh wp14">
+<w:ftr xmlns:wpc="http://schemas.microsoft.com/office/word/2010/wordprocessingCanvas" xmlns:cx="http://schemas.microsoft.com/office/drawing/2014/chartex" xmlns:cx1="http://schemas.microsoft.com/office/drawing/2015/9/8/chartex" xmlns:cx2="http://schemas.microsoft.com/office/drawing/2015/10/21/chartex" xmlns:cx3="http://schemas.microsoft.com/office/drawing/2016/5/9/chartex" xmlns:cx4="http://schemas.microsoft.com/office/drawing/2016/5/10/chartex" xmlns:cx5="http://schemas.microsoft.com/office/drawing/2016/5/11/chartex" xmlns:cx6="http://schemas.microsoft.com/office/drawing/2016/5/12/chartex" xmlns:cx7="http://schemas.microsoft.com/office/drawing/2016/5/13/chartex" xmlns:cx8="http://schemas.microsoft.com/office/drawing/2016/5/14/chartex" xmlns:mc="http://schemas.openxmlformats.org/markup-compatibility/2006" xmlns:aink="http://schemas.microsoft.com/office/drawing/2016/ink" xmlns:am3d="http://schemas.microsoft.com/office/drawing/2017/model3d" xmlns:o="urn:schemas-microsoft-com:office:office" xmlns:oel="http://schemas.microsoft.com/office/2019/extlst" xmlns:r="http://schemas.openxmlformats.org/officeDocument/2006/relationships" xmlns:m="http://schemas.openxmlformats.org/officeDocument/2006/math" xmlns:v="urn:schemas-microsoft-com:vml" xmlns:wp14="http://schemas.microsoft.com/office/word/2010/wordprocessingDrawing" xmlns:wp="http://schemas.openxmlformats.org/drawingml/2006/wordprocessingDrawing" xmlns:w10="urn:schemas-microsoft-com:office:word" xmlns:w="http://schemas.openxmlformats.org/wordprocessingml/2006/main" xmlns:w14="http://schemas.microsoft.com/office/word/2010/wordml" xmlns:w15="http://schemas.microsoft.com/office/word/2012/wordml" xmlns:w16cex="http://schemas.microsoft.com/office/word/2018/wordml/cex" xmlns:w16cid="http://schemas.microsoft.com/office/word/2016/wordml/cid" xmlns:w16="http://schemas.microsoft.com/office/word/2018/wordml" xmlns:w16sdtdh="http://schemas.microsoft.com/office/word/2020/wordml/sdtdatahash" xmlns:w16se="http://schemas.microsoft.com/office/word/2015/wordml/symex" xmlns:wpg="http://schemas.microsoft.com/office/word/2010/wordprocessingGroup" xmlns:wpi="http://schemas.microsoft.com/office/word/2010/wordprocessingInk" xmlns:wne="http://schemas.microsoft.com/office/word/2006/wordml" xmlns:wps="http://schemas.microsoft.com/office/word/2010/wordprocessingShape" mc:Ignorable="w14 w15 w16se w16cid w16 w16cex w16sdtdh wp14">
   <w:p>
     <w:pPr>
       <w:tabs>
@@ -1398,7 +2347,7 @@
 </file>
 
 <file path=word/footer3.xml><?xml version="1.0" encoding="utf-8"?>
-<w:ftr xmlns:wpc="http://schemas.microsoft.com/office/word/2010/wordprocessingCanvas" xmlns:cx="http://schemas.microsoft.com/office/drawing/2014/chartex" xmlns:cx1="http://schemas.microsoft.com/office/drawing/2015/9/8/chartex" xmlns:cx2="http://schemas.microsoft.com/office/drawing/2015/10/21/chartex" xmlns:cx3="http://schemas.microsoft.com/office/drawing/2016/5/9/chartex" xmlns:cx4="http://schemas.microsoft.com/office/drawing/2016/5/10/chartex" xmlns:cx5="http://schemas.microsoft.com/office/drawing/2016/5/11/chartex" xmlns:cx6="http://schemas.microsoft.com/office/drawing/2016/5/12/chartex" xmlns:cx7="http://schemas.microsoft.com/office/drawing/2016/5/13/chartex" xmlns:cx8="http://schemas.microsoft.com/office/drawing/2016/5/14/chartex" xmlns:mc="http://schemas.openxmlformats.org/markup-compatibility/2006" xmlns:aink="http://schemas.microsoft.com/office/drawing/2016/ink" xmlns:am3d="http://schemas.microsoft.com/office/drawing/2017/model3d" xmlns:o="urn:schemas-microsoft-com:office:office" xmlns:r="http://schemas.openxmlformats.org/officeDocument/2006/relationships" xmlns:m="http://schemas.openxmlformats.org/officeDocument/2006/math" xmlns:v="urn:schemas-microsoft-com:vml" xmlns:wp14="http://schemas.microsoft.com/office/word/2010/wordprocessingDrawing" xmlns:wp="http://schemas.openxmlformats.org/drawingml/2006/wordprocessingDrawing" xmlns:w10="urn:schemas-microsoft-com:office:word" xmlns:w="http://schemas.openxmlformats.org/wordprocessingml/2006/main" xmlns:w14="http://schemas.microsoft.com/office/word/2010/wordml" xmlns:w15="http://schemas.microsoft.com/office/word/2012/wordml" xmlns:w16cex="http://schemas.microsoft.com/office/word/2018/wordml/cex" xmlns:w16cid="http://schemas.microsoft.com/office/word/2016/wordml/cid" xmlns:w16="http://schemas.microsoft.com/office/word/2018/wordml" xmlns:w16sdtdh="http://schemas.microsoft.com/office/word/2020/wordml/sdtdatahash" xmlns:w16se="http://schemas.microsoft.com/office/word/2015/wordml/symex" xmlns:wpg="http://schemas.microsoft.com/office/word/2010/wordprocessingGroup" xmlns:wpi="http://schemas.microsoft.com/office/word/2010/wordprocessingInk" xmlns:wne="http://schemas.microsoft.com/office/word/2006/wordml" xmlns:wps="http://schemas.microsoft.com/office/word/2010/wordprocessingShape" mc:Ignorable="w14 w15 w16se w16cid w16 w16cex w16sdtdh wp14">
+<w:ftr xmlns:wpc="http://schemas.microsoft.com/office/word/2010/wordprocessingCanvas" xmlns:cx="http://schemas.microsoft.com/office/drawing/2014/chartex" xmlns:cx1="http://schemas.microsoft.com/office/drawing/2015/9/8/chartex" xmlns:cx2="http://schemas.microsoft.com/office/drawing/2015/10/21/chartex" xmlns:cx3="http://schemas.microsoft.com/office/drawing/2016/5/9/chartex" xmlns:cx4="http://schemas.microsoft.com/office/drawing/2016/5/10/chartex" xmlns:cx5="http://schemas.microsoft.com/office/drawing/2016/5/11/chartex" xmlns:cx6="http://schemas.microsoft.com/office/drawing/2016/5/12/chartex" xmlns:cx7="http://schemas.microsoft.com/office/drawing/2016/5/13/chartex" xmlns:cx8="http://schemas.microsoft.com/office/drawing/2016/5/14/chartex" xmlns:mc="http://schemas.openxmlformats.org/markup-compatibility/2006" xmlns:aink="http://schemas.microsoft.com/office/drawing/2016/ink" xmlns:am3d="http://schemas.microsoft.com/office/drawing/2017/model3d" xmlns:o="urn:schemas-microsoft-com:office:office" xmlns:oel="http://schemas.microsoft.com/office/2019/extlst" xmlns:r="http://schemas.openxmlformats.org/officeDocument/2006/relationships" xmlns:m="http://schemas.openxmlformats.org/officeDocument/2006/math" xmlns:v="urn:schemas-microsoft-com:vml" xmlns:wp14="http://schemas.microsoft.com/office/word/2010/wordprocessingDrawing" xmlns:wp="http://schemas.openxmlformats.org/drawingml/2006/wordprocessingDrawing" xmlns:w10="urn:schemas-microsoft-com:office:word" xmlns:w="http://schemas.openxmlformats.org/wordprocessingml/2006/main" xmlns:w14="http://schemas.microsoft.com/office/word/2010/wordml" xmlns:w15="http://schemas.microsoft.com/office/word/2012/wordml" xmlns:w16cex="http://schemas.microsoft.com/office/word/2018/wordml/cex" xmlns:w16cid="http://schemas.microsoft.com/office/word/2016/wordml/cid" xmlns:w16="http://schemas.microsoft.com/office/word/2018/wordml" xmlns:w16sdtdh="http://schemas.microsoft.com/office/word/2020/wordml/sdtdatahash" xmlns:w16se="http://schemas.microsoft.com/office/word/2015/wordml/symex" xmlns:wpg="http://schemas.microsoft.com/office/word/2010/wordprocessingGroup" xmlns:wpi="http://schemas.microsoft.com/office/word/2010/wordprocessingInk" xmlns:wne="http://schemas.microsoft.com/office/word/2006/wordml" xmlns:wps="http://schemas.microsoft.com/office/word/2010/wordprocessingShape" mc:Ignorable="w14 w15 w16se w16cid w16 w16cex w16sdtdh wp14">
   <w:p>
     <w:pPr>
       <w:pStyle w:val="Footer"/>
@@ -1408,7 +2357,7 @@
 </file>
 
 <file path=word/footnotes.xml><?xml version="1.0" encoding="utf-8"?>
-<w:footnotes xmlns:wpc="http://schemas.microsoft.com/office/word/2010/wordprocessingCanvas" xmlns:cx="http://schemas.microsoft.com/office/drawing/2014/chartex" xmlns:cx1="http://schemas.microsoft.com/office/drawing/2015/9/8/chartex" xmlns:cx2="http://schemas.microsoft.com/office/drawing/2015/10/21/chartex" xmlns:cx3="http://schemas.microsoft.com/office/drawing/2016/5/9/chartex" xmlns:cx4="http://schemas.microsoft.com/office/drawing/2016/5/10/chartex" xmlns:cx5="http://schemas.microsoft.com/office/drawing/2016/5/11/chartex" xmlns:cx6="http://schemas.microsoft.com/office/drawing/2016/5/12/chartex" xmlns:cx7="http://schemas.microsoft.com/office/drawing/2016/5/13/chartex" xmlns:cx8="http://schemas.microsoft.com/office/drawing/2016/5/14/chartex" xmlns:mc="http://schemas.openxmlformats.org/markup-compatibility/2006" xmlns:aink="http://schemas.microsoft.com/office/drawing/2016/ink" xmlns:am3d="http://schemas.microsoft.com/office/drawing/2017/model3d" xmlns:o="urn:schemas-microsoft-com:office:office" xmlns:r="http://schemas.openxmlformats.org/officeDocument/2006/relationships" xmlns:m="http://schemas.openxmlformats.org/officeDocument/2006/math" xmlns:v="urn:schemas-microsoft-com:vml" xmlns:wp14="http://schemas.microsoft.com/office/word/2010/wordprocessingDrawing" xmlns:wp="http://schemas.openxmlformats.org/drawingml/2006/wordprocessingDrawing" xmlns:w10="urn:schemas-microsoft-com:office:word" xmlns:w="http://schemas.openxmlformats.org/wordprocessingml/2006/main" xmlns:w14="http://schemas.microsoft.com/office/word/2010/wordml" xmlns:w15="http://schemas.microsoft.com/office/word/2012/wordml" xmlns:w16cex="http://schemas.microsoft.com/office/word/2018/wordml/cex" xmlns:w16cid="http://schemas.microsoft.com/office/word/2016/wordml/cid" xmlns:w16="http://schemas.microsoft.com/office/word/2018/wordml" xmlns:w16sdtdh="http://schemas.microsoft.com/office/word/2020/wordml/sdtdatahash" xmlns:w16se="http://schemas.microsoft.com/office/word/2015/wordml/symex" xmlns:wpg="http://schemas.microsoft.com/office/word/2010/wordprocessingGroup" xmlns:wpi="http://schemas.microsoft.com/office/word/2010/wordprocessingInk" xmlns:wne="http://schemas.microsoft.com/office/word/2006/wordml" xmlns:wps="http://schemas.microsoft.com/office/word/2010/wordprocessingShape" mc:Ignorable="w14 w15 w16se w16cid w16 w16cex w16sdtdh wp14">
+<w:footnotes xmlns:wpc="http://schemas.microsoft.com/office/word/2010/wordprocessingCanvas" xmlns:cx="http://schemas.microsoft.com/office/drawing/2014/chartex" xmlns:cx1="http://schemas.microsoft.com/office/drawing/2015/9/8/chartex" xmlns:cx2="http://schemas.microsoft.com/office/drawing/2015/10/21/chartex" xmlns:cx3="http://schemas.microsoft.com/office/drawing/2016/5/9/chartex" xmlns:cx4="http://schemas.microsoft.com/office/drawing/2016/5/10/chartex" xmlns:cx5="http://schemas.microsoft.com/office/drawing/2016/5/11/chartex" xmlns:cx6="http://schemas.microsoft.com/office/drawing/2016/5/12/chartex" xmlns:cx7="http://schemas.microsoft.com/office/drawing/2016/5/13/chartex" xmlns:cx8="http://schemas.microsoft.com/office/drawing/2016/5/14/chartex" xmlns:mc="http://schemas.openxmlformats.org/markup-compatibility/2006" xmlns:aink="http://schemas.microsoft.com/office/drawing/2016/ink" xmlns:am3d="http://schemas.microsoft.com/office/drawing/2017/model3d" xmlns:o="urn:schemas-microsoft-com:office:office" xmlns:oel="http://schemas.microsoft.com/office/2019/extlst" xmlns:r="http://schemas.openxmlformats.org/officeDocument/2006/relationships" xmlns:m="http://schemas.openxmlformats.org/officeDocument/2006/math" xmlns:v="urn:schemas-microsoft-com:vml" xmlns:wp14="http://schemas.microsoft.com/office/word/2010/wordprocessingDrawing" xmlns:wp="http://schemas.openxmlformats.org/drawingml/2006/wordprocessingDrawing" xmlns:w10="urn:schemas-microsoft-com:office:word" xmlns:w="http://schemas.openxmlformats.org/wordprocessingml/2006/main" xmlns:w14="http://schemas.microsoft.com/office/word/2010/wordml" xmlns:w15="http://schemas.microsoft.com/office/word/2012/wordml" xmlns:w16cex="http://schemas.microsoft.com/office/word/2018/wordml/cex" xmlns:w16cid="http://schemas.microsoft.com/office/word/2016/wordml/cid" xmlns:w16="http://schemas.microsoft.com/office/word/2018/wordml" xmlns:w16sdtdh="http://schemas.microsoft.com/office/word/2020/wordml/sdtdatahash" xmlns:w16se="http://schemas.microsoft.com/office/word/2015/wordml/symex" xmlns:wpg="http://schemas.microsoft.com/office/word/2010/wordprocessingGroup" xmlns:wpi="http://schemas.microsoft.com/office/word/2010/wordprocessingInk" xmlns:wne="http://schemas.microsoft.com/office/word/2006/wordml" xmlns:wps="http://schemas.microsoft.com/office/word/2010/wordprocessingShape" mc:Ignorable="w14 w15 w16se w16cid w16 w16cex w16sdtdh wp14">
   <w:footnote w:type="separator" w:id="-1">
     <w:p>
       <w:pPr>
@@ -1433,7 +2382,7 @@
 </file>
 
 <file path=word/header1.xml><?xml version="1.0" encoding="utf-8"?>
-<w:hdr xmlns:wpc="http://schemas.microsoft.com/office/word/2010/wordprocessingCanvas" xmlns:cx="http://schemas.microsoft.com/office/drawing/2014/chartex" xmlns:cx1="http://schemas.microsoft.com/office/drawing/2015/9/8/chartex" xmlns:cx2="http://schemas.microsoft.com/office/drawing/2015/10/21/chartex" xmlns:cx3="http://schemas.microsoft.com/office/drawing/2016/5/9/chartex" xmlns:cx4="http://schemas.microsoft.com/office/drawing/2016/5/10/chartex" xmlns:cx5="http://schemas.microsoft.com/office/drawing/2016/5/11/chartex" xmlns:cx6="http://schemas.microsoft.com/office/drawing/2016/5/12/chartex" xmlns:cx7="http://schemas.microsoft.com/office/drawing/2016/5/13/chartex" xmlns:cx8="http://schemas.microsoft.com/office/drawing/2016/5/14/chartex" xmlns:mc="http://schemas.openxmlformats.org/markup-compatibility/2006" xmlns:aink="http://schemas.microsoft.com/office/drawing/2016/ink" xmlns:am3d="http://schemas.microsoft.com/office/drawing/2017/model3d" xmlns:o="urn:schemas-microsoft-com:office:office" xmlns:r="http://schemas.openxmlformats.org/officeDocument/2006/relationships" xmlns:m="http://schemas.openxmlformats.org/officeDocument/2006/math" xmlns:v="urn:schemas-microsoft-com:vml" xmlns:wp14="http://schemas.microsoft.com/office/word/2010/wordprocessingDrawing" xmlns:wp="http://schemas.openxmlformats.org/drawingml/2006/wordprocessingDrawing" xmlns:w10="urn:schemas-microsoft-com:office:word" xmlns:w="http://schemas.openxmlformats.org/wordprocessingml/2006/main" xmlns:w14="http://schemas.microsoft.com/office/word/2010/wordml" xmlns:w15="http://schemas.microsoft.com/office/word/2012/wordml" xmlns:w16cex="http://schemas.microsoft.com/office/word/2018/wordml/cex" xmlns:w16cid="http://schemas.microsoft.com/office/word/2016/wordml/cid" xmlns:w16="http://schemas.microsoft.com/office/word/2018/wordml" xmlns:w16sdtdh="http://schemas.microsoft.com/office/word/2020/wordml/sdtdatahash" xmlns:w16se="http://schemas.microsoft.com/office/word/2015/wordml/symex" xmlns:wpg="http://schemas.microsoft.com/office/word/2010/wordprocessingGroup" xmlns:wpi="http://schemas.microsoft.com/office/word/2010/wordprocessingInk" xmlns:wne="http://schemas.microsoft.com/office/word/2006/wordml" xmlns:wps="http://schemas.microsoft.com/office/word/2010/wordprocessingShape" mc:Ignorable="w14 w15 w16se w16cid w16 w16cex w16sdtdh wp14">
+<w:hdr xmlns:wpc="http://schemas.microsoft.com/office/word/2010/wordprocessingCanvas" xmlns:cx="http://schemas.microsoft.com/office/drawing/2014/chartex" xmlns:cx1="http://schemas.microsoft.com/office/drawing/2015/9/8/chartex" xmlns:cx2="http://schemas.microsoft.com/office/drawing/2015/10/21/chartex" xmlns:cx3="http://schemas.microsoft.com/office/drawing/2016/5/9/chartex" xmlns:cx4="http://schemas.microsoft.com/office/drawing/2016/5/10/chartex" xmlns:cx5="http://schemas.microsoft.com/office/drawing/2016/5/11/chartex" xmlns:cx6="http://schemas.microsoft.com/office/drawing/2016/5/12/chartex" xmlns:cx7="http://schemas.microsoft.com/office/drawing/2016/5/13/chartex" xmlns:cx8="http://schemas.microsoft.com/office/drawing/2016/5/14/chartex" xmlns:mc="http://schemas.openxmlformats.org/markup-compatibility/2006" xmlns:aink="http://schemas.microsoft.com/office/drawing/2016/ink" xmlns:am3d="http://schemas.microsoft.com/office/drawing/2017/model3d" xmlns:o="urn:schemas-microsoft-com:office:office" xmlns:oel="http://schemas.microsoft.com/office/2019/extlst" xmlns:r="http://schemas.openxmlformats.org/officeDocument/2006/relationships" xmlns:m="http://schemas.openxmlformats.org/officeDocument/2006/math" xmlns:v="urn:schemas-microsoft-com:vml" xmlns:wp14="http://schemas.microsoft.com/office/word/2010/wordprocessingDrawing" xmlns:wp="http://schemas.openxmlformats.org/drawingml/2006/wordprocessingDrawing" xmlns:w10="urn:schemas-microsoft-com:office:word" xmlns:w="http://schemas.openxmlformats.org/wordprocessingml/2006/main" xmlns:w14="http://schemas.microsoft.com/office/word/2010/wordml" xmlns:w15="http://schemas.microsoft.com/office/word/2012/wordml" xmlns:w16cex="http://schemas.microsoft.com/office/word/2018/wordml/cex" xmlns:w16cid="http://schemas.microsoft.com/office/word/2016/wordml/cid" xmlns:w16="http://schemas.microsoft.com/office/word/2018/wordml" xmlns:w16sdtdh="http://schemas.microsoft.com/office/word/2020/wordml/sdtdatahash" xmlns:w16se="http://schemas.microsoft.com/office/word/2015/wordml/symex" xmlns:wpg="http://schemas.microsoft.com/office/word/2010/wordprocessingGroup" xmlns:wpi="http://schemas.microsoft.com/office/word/2010/wordprocessingInk" xmlns:wne="http://schemas.microsoft.com/office/word/2006/wordml" xmlns:wps="http://schemas.microsoft.com/office/word/2010/wordprocessingShape" mc:Ignorable="w14 w15 w16se w16cid w16 w16cex w16sdtdh wp14">
   <w:p>
     <w:pPr>
       <w:pStyle w:val="Header"/>
@@ -1443,7 +2392,7 @@
 </file>
 
 <file path=word/header2.xml><?xml version="1.0" encoding="utf-8"?>
-<w:hdr xmlns:wpc="http://schemas.microsoft.com/office/word/2010/wordprocessingCanvas" xmlns:cx="http://schemas.microsoft.com/office/drawing/2014/chartex" xmlns:cx1="http://schemas.microsoft.com/office/drawing/2015/9/8/chartex" xmlns:cx2="http://schemas.microsoft.com/office/drawing/2015/10/21/chartex" xmlns:cx3="http://schemas.microsoft.com/office/drawing/2016/5/9/chartex" xmlns:cx4="http://schemas.microsoft.com/office/drawing/2016/5/10/chartex" xmlns:cx5="http://schemas.microsoft.com/office/drawing/2016/5/11/chartex" xmlns:cx6="http://schemas.microsoft.com/office/drawing/2016/5/12/chartex" xmlns:cx7="http://schemas.microsoft.com/office/drawing/2016/5/13/chartex" xmlns:cx8="http://schemas.microsoft.com/office/drawing/2016/5/14/chartex" xmlns:mc="http://schemas.openxmlformats.org/markup-compatibility/2006" xmlns:aink="http://schemas.microsoft.com/office/drawing/2016/ink" xmlns:am3d="http://schemas.microsoft.com/office/drawing/2017/model3d" xmlns:o="urn:schemas-microsoft-com:office:office" xmlns:r="http://schemas.openxmlformats.org/officeDocument/2006/relationships" xmlns:m="http://schemas.openxmlformats.org/officeDocument/2006/math" xmlns:v="urn:schemas-microsoft-com:vml" xmlns:wp14="http://schemas.microsoft.com/office/word/2010/wordprocessingDrawing" xmlns:wp="http://schemas.openxmlformats.org/drawingml/2006/wordprocessingDrawing" xmlns:w10="urn:schemas-microsoft-com:office:word" xmlns:w="http://schemas.openxmlformats.org/wordprocessingml/2006/main" xmlns:w14="http://schemas.microsoft.com/office/word/2010/wordml" xmlns:w15="http://schemas.microsoft.com/office/word/2012/wordml" xmlns:w16cex="http://schemas.microsoft.com/office/word/2018/wordml/cex" xmlns:w16cid="http://schemas.microsoft.com/office/word/2016/wordml/cid" xmlns:w16="http://schemas.microsoft.com/office/word/2018/wordml" xmlns:w16sdtdh="http://schemas.microsoft.com/office/word/2020/wordml/sdtdatahash" xmlns:w16se="http://schemas.microsoft.com/office/word/2015/wordml/symex" xmlns:wpg="http://schemas.microsoft.com/office/word/2010/wordprocessingGroup" xmlns:wpi="http://schemas.microsoft.com/office/word/2010/wordprocessingInk" xmlns:wne="http://schemas.microsoft.com/office/word/2006/wordml" xmlns:wps="http://schemas.microsoft.com/office/word/2010/wordprocessingShape" mc:Ignorable="w14 w15 w16se w16cid w16 w16cex w16sdtdh wp14">
+<w:hdr xmlns:wpc="http://schemas.microsoft.com/office/word/2010/wordprocessingCanvas" xmlns:cx="http://schemas.microsoft.com/office/drawing/2014/chartex" xmlns:cx1="http://schemas.microsoft.com/office/drawing/2015/9/8/chartex" xmlns:cx2="http://schemas.microsoft.com/office/drawing/2015/10/21/chartex" xmlns:cx3="http://schemas.microsoft.com/office/drawing/2016/5/9/chartex" xmlns:cx4="http://schemas.microsoft.com/office/drawing/2016/5/10/chartex" xmlns:cx5="http://schemas.microsoft.com/office/drawing/2016/5/11/chartex" xmlns:cx6="http://schemas.microsoft.com/office/drawing/2016/5/12/chartex" xmlns:cx7="http://schemas.microsoft.com/office/drawing/2016/5/13/chartex" xmlns:cx8="http://schemas.microsoft.com/office/drawing/2016/5/14/chartex" xmlns:mc="http://schemas.openxmlformats.org/markup-compatibility/2006" xmlns:aink="http://schemas.microsoft.com/office/drawing/2016/ink" xmlns:am3d="http://schemas.microsoft.com/office/drawing/2017/model3d" xmlns:o="urn:schemas-microsoft-com:office:office" xmlns:oel="http://schemas.microsoft.com/office/2019/extlst" xmlns:r="http://schemas.openxmlformats.org/officeDocument/2006/relationships" xmlns:m="http://schemas.openxmlformats.org/officeDocument/2006/math" xmlns:v="urn:schemas-microsoft-com:vml" xmlns:wp14="http://schemas.microsoft.com/office/word/2010/wordprocessingDrawing" xmlns:wp="http://schemas.openxmlformats.org/drawingml/2006/wordprocessingDrawing" xmlns:w10="urn:schemas-microsoft-com:office:word" xmlns:w="http://schemas.openxmlformats.org/wordprocessingml/2006/main" xmlns:w14="http://schemas.microsoft.com/office/word/2010/wordml" xmlns:w15="http://schemas.microsoft.com/office/word/2012/wordml" xmlns:w16cex="http://schemas.microsoft.com/office/word/2018/wordml/cex" xmlns:w16cid="http://schemas.microsoft.com/office/word/2016/wordml/cid" xmlns:w16="http://schemas.microsoft.com/office/word/2018/wordml" xmlns:w16sdtdh="http://schemas.microsoft.com/office/word/2020/wordml/sdtdatahash" xmlns:w16se="http://schemas.microsoft.com/office/word/2015/wordml/symex" xmlns:wpg="http://schemas.microsoft.com/office/word/2010/wordprocessingGroup" xmlns:wpi="http://schemas.microsoft.com/office/word/2010/wordprocessingInk" xmlns:wne="http://schemas.microsoft.com/office/word/2006/wordml" xmlns:wps="http://schemas.microsoft.com/office/word/2010/wordprocessingShape" mc:Ignorable="w14 w15 w16se w16cid w16 w16cex w16sdtdh wp14">
   <w:p>
     <w:pPr>
       <w:tabs>
@@ -1522,7 +2471,6 @@
           <w:docPart w:val="DefaultPlaceholder_-1854013440"/>
         </w:placeholder>
       </w:sdtPr>
-      <w:sdtEndPr/>
       <w:sdtContent>
         <w:r>
           <w:rPr>
@@ -1567,7 +2515,6 @@
           <w:docPart w:val="DefaultPlaceholder_-1854013440"/>
         </w:placeholder>
       </w:sdtPr>
-      <w:sdtEndPr/>
       <w:sdtContent>
         <w:r>
           <w:rPr>
@@ -1595,7 +2542,7 @@
 </file>
 
 <file path=word/header3.xml><?xml version="1.0" encoding="utf-8"?>
-<w:hdr xmlns:wpc="http://schemas.microsoft.com/office/word/2010/wordprocessingCanvas" xmlns:cx="http://schemas.microsoft.com/office/drawing/2014/chartex" xmlns:cx1="http://schemas.microsoft.com/office/drawing/2015/9/8/chartex" xmlns:cx2="http://schemas.microsoft.com/office/drawing/2015/10/21/chartex" xmlns:cx3="http://schemas.microsoft.com/office/drawing/2016/5/9/chartex" xmlns:cx4="http://schemas.microsoft.com/office/drawing/2016/5/10/chartex" xmlns:cx5="http://schemas.microsoft.com/office/drawing/2016/5/11/chartex" xmlns:cx6="http://schemas.microsoft.com/office/drawing/2016/5/12/chartex" xmlns:cx7="http://schemas.microsoft.com/office/drawing/2016/5/13/chartex" xmlns:cx8="http://schemas.microsoft.com/office/drawing/2016/5/14/chartex" xmlns:mc="http://schemas.openxmlformats.org/markup-compatibility/2006" xmlns:aink="http://schemas.microsoft.com/office/drawing/2016/ink" xmlns:am3d="http://schemas.microsoft.com/office/drawing/2017/model3d" xmlns:o="urn:schemas-microsoft-com:office:office" xmlns:r="http://schemas.openxmlformats.org/officeDocument/2006/relationships" xmlns:m="http://schemas.openxmlformats.org/officeDocument/2006/math" xmlns:v="urn:schemas-microsoft-com:vml" xmlns:wp14="http://schemas.microsoft.com/office/word/2010/wordprocessingDrawing" xmlns:wp="http://schemas.openxmlformats.org/drawingml/2006/wordprocessingDrawing" xmlns:w10="urn:schemas-microsoft-com:office:word" xmlns:w="http://schemas.openxmlformats.org/wordprocessingml/2006/main" xmlns:w14="http://schemas.microsoft.com/office/word/2010/wordml" xmlns:w15="http://schemas.microsoft.com/office/word/2012/wordml" xmlns:w16cex="http://schemas.microsoft.com/office/word/2018/wordml/cex" xmlns:w16cid="http://schemas.microsoft.com/office/word/2016/wordml/cid" xmlns:w16="http://schemas.microsoft.com/office/word/2018/wordml" xmlns:w16sdtdh="http://schemas.microsoft.com/office/word/2020/wordml/sdtdatahash" xmlns:w16se="http://schemas.microsoft.com/office/word/2015/wordml/symex" xmlns:wpg="http://schemas.microsoft.com/office/word/2010/wordprocessingGroup" xmlns:wpi="http://schemas.microsoft.com/office/word/2010/wordprocessingInk" xmlns:wne="http://schemas.microsoft.com/office/word/2006/wordml" xmlns:wps="http://schemas.microsoft.com/office/word/2010/wordprocessingShape" mc:Ignorable="w14 w15 w16se w16cid w16 w16cex w16sdtdh wp14">
+<w:hdr xmlns:wpc="http://schemas.microsoft.com/office/word/2010/wordprocessingCanvas" xmlns:cx="http://schemas.microsoft.com/office/drawing/2014/chartex" xmlns:cx1="http://schemas.microsoft.com/office/drawing/2015/9/8/chartex" xmlns:cx2="http://schemas.microsoft.com/office/drawing/2015/10/21/chartex" xmlns:cx3="http://schemas.microsoft.com/office/drawing/2016/5/9/chartex" xmlns:cx4="http://schemas.microsoft.com/office/drawing/2016/5/10/chartex" xmlns:cx5="http://schemas.microsoft.com/office/drawing/2016/5/11/chartex" xmlns:cx6="http://schemas.microsoft.com/office/drawing/2016/5/12/chartex" xmlns:cx7="http://schemas.microsoft.com/office/drawing/2016/5/13/chartex" xmlns:cx8="http://schemas.microsoft.com/office/drawing/2016/5/14/chartex" xmlns:mc="http://schemas.openxmlformats.org/markup-compatibility/2006" xmlns:aink="http://schemas.microsoft.com/office/drawing/2016/ink" xmlns:am3d="http://schemas.microsoft.com/office/drawing/2017/model3d" xmlns:o="urn:schemas-microsoft-com:office:office" xmlns:oel="http://schemas.microsoft.com/office/2019/extlst" xmlns:r="http://schemas.openxmlformats.org/officeDocument/2006/relationships" xmlns:m="http://schemas.openxmlformats.org/officeDocument/2006/math" xmlns:v="urn:schemas-microsoft-com:vml" xmlns:wp14="http://schemas.microsoft.com/office/word/2010/wordprocessingDrawing" xmlns:wp="http://schemas.openxmlformats.org/drawingml/2006/wordprocessingDrawing" xmlns:w10="urn:schemas-microsoft-com:office:word" xmlns:w="http://schemas.openxmlformats.org/wordprocessingml/2006/main" xmlns:w14="http://schemas.microsoft.com/office/word/2010/wordml" xmlns:w15="http://schemas.microsoft.com/office/word/2012/wordml" xmlns:w16cex="http://schemas.microsoft.com/office/word/2018/wordml/cex" xmlns:w16cid="http://schemas.microsoft.com/office/word/2016/wordml/cid" xmlns:w16="http://schemas.microsoft.com/office/word/2018/wordml" xmlns:w16sdtdh="http://schemas.microsoft.com/office/word/2020/wordml/sdtdatahash" xmlns:w16se="http://schemas.microsoft.com/office/word/2015/wordml/symex" xmlns:wpg="http://schemas.microsoft.com/office/word/2010/wordprocessingGroup" xmlns:wpi="http://schemas.microsoft.com/office/word/2010/wordprocessingInk" xmlns:wne="http://schemas.microsoft.com/office/word/2006/wordml" xmlns:wps="http://schemas.microsoft.com/office/word/2010/wordprocessingShape" mc:Ignorable="w14 w15 w16se w16cid w16 w16cex w16sdtdh wp14">
   <w:p>
     <w:pPr>
       <w:pStyle w:val="Header"/>
@@ -1605,7 +2552,7 @@
 </file>
 
 <file path=word/numbering.xml><?xml version="1.0" encoding="utf-8"?>
-<w:numbering xmlns:wpc="http://schemas.microsoft.com/office/word/2010/wordprocessingCanvas" xmlns:cx="http://schemas.microsoft.com/office/drawing/2014/chartex" xmlns:cx1="http://schemas.microsoft.com/office/drawing/2015/9/8/chartex" xmlns:cx2="http://schemas.microsoft.com/office/drawing/2015/10/21/chartex" xmlns:cx3="http://schemas.microsoft.com/office/drawing/2016/5/9/chartex" xmlns:cx4="http://schemas.microsoft.com/office/drawing/2016/5/10/chartex" xmlns:cx5="http://schemas.microsoft.com/office/drawing/2016/5/11/chartex" xmlns:cx6="http://schemas.microsoft.com/office/drawing/2016/5/12/chartex" xmlns:cx7="http://schemas.microsoft.com/office/drawing/2016/5/13/chartex" xmlns:cx8="http://schemas.microsoft.com/office/drawing/2016/5/14/chartex" xmlns:mc="http://schemas.openxmlformats.org/markup-compatibility/2006" xmlns:aink="http://schemas.microsoft.com/office/drawing/2016/ink" xmlns:am3d="http://schemas.microsoft.com/office/drawing/2017/model3d" xmlns:o="urn:schemas-microsoft-com:office:office" xmlns:r="http://schemas.openxmlformats.org/officeDocument/2006/relationships" xmlns:m="http://schemas.openxmlformats.org/officeDocument/2006/math" xmlns:v="urn:schemas-microsoft-com:vml" xmlns:wp14="http://schemas.microsoft.com/office/word/2010/wordprocessingDrawing" xmlns:wp="http://schemas.openxmlformats.org/drawingml/2006/wordprocessingDrawing" xmlns:w10="urn:schemas-microsoft-com:office:word" xmlns:w="http://schemas.openxmlformats.org/wordprocessingml/2006/main" xmlns:w14="http://schemas.microsoft.com/office/word/2010/wordml" xmlns:w15="http://schemas.microsoft.com/office/word/2012/wordml" xmlns:w16cex="http://schemas.microsoft.com/office/word/2018/wordml/cex" xmlns:w16cid="http://schemas.microsoft.com/office/word/2016/wordml/cid" xmlns:w16="http://schemas.microsoft.com/office/word/2018/wordml" xmlns:w16sdtdh="http://schemas.microsoft.com/office/word/2020/wordml/sdtdatahash" xmlns:w16se="http://schemas.microsoft.com/office/word/2015/wordml/symex" xmlns:wpg="http://schemas.microsoft.com/office/word/2010/wordprocessingGroup" xmlns:wpi="http://schemas.microsoft.com/office/word/2010/wordprocessingInk" xmlns:wne="http://schemas.microsoft.com/office/word/2006/wordml" xmlns:wps="http://schemas.microsoft.com/office/word/2010/wordprocessingShape" mc:Ignorable="w14 w15 w16se w16cid w16 w16cex w16sdtdh wp14">
+<w:numbering xmlns:wpc="http://schemas.microsoft.com/office/word/2010/wordprocessingCanvas" xmlns:cx="http://schemas.microsoft.com/office/drawing/2014/chartex" xmlns:cx1="http://schemas.microsoft.com/office/drawing/2015/9/8/chartex" xmlns:cx2="http://schemas.microsoft.com/office/drawing/2015/10/21/chartex" xmlns:cx3="http://schemas.microsoft.com/office/drawing/2016/5/9/chartex" xmlns:cx4="http://schemas.microsoft.com/office/drawing/2016/5/10/chartex" xmlns:cx5="http://schemas.microsoft.com/office/drawing/2016/5/11/chartex" xmlns:cx6="http://schemas.microsoft.com/office/drawing/2016/5/12/chartex" xmlns:cx7="http://schemas.microsoft.com/office/drawing/2016/5/13/chartex" xmlns:cx8="http://schemas.microsoft.com/office/drawing/2016/5/14/chartex" xmlns:mc="http://schemas.openxmlformats.org/markup-compatibility/2006" xmlns:aink="http://schemas.microsoft.com/office/drawing/2016/ink" xmlns:am3d="http://schemas.microsoft.com/office/drawing/2017/model3d" xmlns:o="urn:schemas-microsoft-com:office:office" xmlns:oel="http://schemas.microsoft.com/office/2019/extlst" xmlns:r="http://schemas.openxmlformats.org/officeDocument/2006/relationships" xmlns:m="http://schemas.openxmlformats.org/officeDocument/2006/math" xmlns:v="urn:schemas-microsoft-com:vml" xmlns:wp14="http://schemas.microsoft.com/office/word/2010/wordprocessingDrawing" xmlns:wp="http://schemas.openxmlformats.org/drawingml/2006/wordprocessingDrawing" xmlns:w10="urn:schemas-microsoft-com:office:word" xmlns:w="http://schemas.openxmlformats.org/wordprocessingml/2006/main" xmlns:w14="http://schemas.microsoft.com/office/word/2010/wordml" xmlns:w15="http://schemas.microsoft.com/office/word/2012/wordml" xmlns:w16cex="http://schemas.microsoft.com/office/word/2018/wordml/cex" xmlns:w16cid="http://schemas.microsoft.com/office/word/2016/wordml/cid" xmlns:w16="http://schemas.microsoft.com/office/word/2018/wordml" xmlns:w16sdtdh="http://schemas.microsoft.com/office/word/2020/wordml/sdtdatahash" xmlns:w16se="http://schemas.microsoft.com/office/word/2015/wordml/symex" xmlns:wpg="http://schemas.microsoft.com/office/word/2010/wordprocessingGroup" xmlns:wpi="http://schemas.microsoft.com/office/word/2010/wordprocessingInk" xmlns:wne="http://schemas.microsoft.com/office/word/2006/wordml" xmlns:wps="http://schemas.microsoft.com/office/word/2010/wordprocessingShape" mc:Ignorable="w14 w15 w16se w16cid w16 w16cex w16sdtdh wp14">
   <w:abstractNum w:abstractNumId="0" w15:restartNumberingAfterBreak="0">
     <w:nsid w:val="04AA1257"/>
     <w:multiLevelType w:val="hybridMultilevel"/>
@@ -1809,10 +2756,10 @@
       </w:rPr>
     </w:lvl>
   </w:abstractNum>
-  <w:num w:numId="1">
+  <w:num w:numId="1" w16cid:durableId="1408259247">
     <w:abstractNumId w:val="1"/>
   </w:num>
-  <w:num w:numId="2">
+  <w:num w:numId="2" w16cid:durableId="1037002714">
     <w:abstractNumId w:val="0"/>
   </w:num>
 </w:numbering>
@@ -2625,7 +3572,7 @@
 </file>
 
 <file path=word/glossary/document.xml><?xml version="1.0" encoding="utf-8"?>
-<w:glossaryDocument xmlns:wpc="http://schemas.microsoft.com/office/word/2010/wordprocessingCanvas" xmlns:cx="http://schemas.microsoft.com/office/drawing/2014/chartex" xmlns:cx1="http://schemas.microsoft.com/office/drawing/2015/9/8/chartex" xmlns:cx2="http://schemas.microsoft.com/office/drawing/2015/10/21/chartex" xmlns:cx3="http://schemas.microsoft.com/office/drawing/2016/5/9/chartex" xmlns:cx4="http://schemas.microsoft.com/office/drawing/2016/5/10/chartex" xmlns:cx5="http://schemas.microsoft.com/office/drawing/2016/5/11/chartex" xmlns:cx6="http://schemas.microsoft.com/office/drawing/2016/5/12/chartex" xmlns:cx7="http://schemas.microsoft.com/office/drawing/2016/5/13/chartex" xmlns:cx8="http://schemas.microsoft.com/office/drawing/2016/5/14/chartex" xmlns:mc="http://schemas.openxmlformats.org/markup-compatibility/2006" xmlns:aink="http://schemas.microsoft.com/office/drawing/2016/ink" xmlns:am3d="http://schemas.microsoft.com/office/drawing/2017/model3d" xmlns:o="urn:schemas-microsoft-com:office:office" xmlns:r="http://schemas.openxmlformats.org/officeDocument/2006/relationships" xmlns:m="http://schemas.openxmlformats.org/officeDocument/2006/math" xmlns:v="urn:schemas-microsoft-com:vml" xmlns:wp14="http://schemas.microsoft.com/office/word/2010/wordprocessingDrawing" xmlns:wp="http://schemas.openxmlformats.org/drawingml/2006/wordprocessingDrawing" xmlns:w10="urn:schemas-microsoft-com:office:word" xmlns:w="http://schemas.openxmlformats.org/wordprocessingml/2006/main" xmlns:w14="http://schemas.microsoft.com/office/word/2010/wordml" xmlns:w15="http://schemas.microsoft.com/office/word/2012/wordml" xmlns:w16cex="http://schemas.microsoft.com/office/word/2018/wordml/cex" xmlns:w16cid="http://schemas.microsoft.com/office/word/2016/wordml/cid" xmlns:w16="http://schemas.microsoft.com/office/word/2018/wordml" xmlns:w16sdtdh="http://schemas.microsoft.com/office/word/2020/wordml/sdtdatahash" xmlns:w16se="http://schemas.microsoft.com/office/word/2015/wordml/symex" xmlns:wpg="http://schemas.microsoft.com/office/word/2010/wordprocessingGroup" xmlns:wpi="http://schemas.microsoft.com/office/word/2010/wordprocessingInk" xmlns:wne="http://schemas.microsoft.com/office/word/2006/wordml" xmlns:wps="http://schemas.microsoft.com/office/word/2010/wordprocessingShape" mc:Ignorable="w14 w15 w16se w16cid w16 w16cex w16sdtdh wp14">
+<w:glossaryDocument xmlns:wpc="http://schemas.microsoft.com/office/word/2010/wordprocessingCanvas" xmlns:cx="http://schemas.microsoft.com/office/drawing/2014/chartex" xmlns:cx1="http://schemas.microsoft.com/office/drawing/2015/9/8/chartex" xmlns:cx2="http://schemas.microsoft.com/office/drawing/2015/10/21/chartex" xmlns:cx3="http://schemas.microsoft.com/office/drawing/2016/5/9/chartex" xmlns:cx4="http://schemas.microsoft.com/office/drawing/2016/5/10/chartex" xmlns:cx5="http://schemas.microsoft.com/office/drawing/2016/5/11/chartex" xmlns:cx6="http://schemas.microsoft.com/office/drawing/2016/5/12/chartex" xmlns:cx7="http://schemas.microsoft.com/office/drawing/2016/5/13/chartex" xmlns:cx8="http://schemas.microsoft.com/office/drawing/2016/5/14/chartex" xmlns:mc="http://schemas.openxmlformats.org/markup-compatibility/2006" xmlns:aink="http://schemas.microsoft.com/office/drawing/2016/ink" xmlns:am3d="http://schemas.microsoft.com/office/drawing/2017/model3d" xmlns:o="urn:schemas-microsoft-com:office:office" xmlns:oel="http://schemas.microsoft.com/office/2019/extlst" xmlns:r="http://schemas.openxmlformats.org/officeDocument/2006/relationships" xmlns:m="http://schemas.openxmlformats.org/officeDocument/2006/math" xmlns:v="urn:schemas-microsoft-com:vml" xmlns:wp14="http://schemas.microsoft.com/office/word/2010/wordprocessingDrawing" xmlns:wp="http://schemas.openxmlformats.org/drawingml/2006/wordprocessingDrawing" xmlns:w10="urn:schemas-microsoft-com:office:word" xmlns:w="http://schemas.openxmlformats.org/wordprocessingml/2006/main" xmlns:w14="http://schemas.microsoft.com/office/word/2010/wordml" xmlns:w15="http://schemas.microsoft.com/office/word/2012/wordml" xmlns:w16cex="http://schemas.microsoft.com/office/word/2018/wordml/cex" xmlns:w16cid="http://schemas.microsoft.com/office/word/2016/wordml/cid" xmlns:w16="http://schemas.microsoft.com/office/word/2018/wordml" xmlns:w16sdtdh="http://schemas.microsoft.com/office/word/2020/wordml/sdtdatahash" xmlns:w16se="http://schemas.microsoft.com/office/word/2015/wordml/symex" xmlns:wpg="http://schemas.microsoft.com/office/word/2010/wordprocessingGroup" xmlns:wpi="http://schemas.microsoft.com/office/word/2010/wordprocessingInk" xmlns:wne="http://schemas.microsoft.com/office/word/2006/wordml" xmlns:wps="http://schemas.microsoft.com/office/word/2010/wordprocessingShape" mc:Ignorable="w14 w15 w16se w16cid w16 w16cex w16sdtdh wp14">
   <w:docParts>
     <w:docPart>
       <w:docPartPr>
@@ -2800,6 +3747,312 @@
               <w:szCs w:val="20"/>
             </w:rPr>
             <w:t>value</w:t>
+          </w:r>
+        </w:p>
+      </w:docPartBody>
+    </w:docPart>
+    <w:docPart>
+      <w:docPartPr>
+        <w:name w:val="2D24977013E144B1B2424420B1277E29"/>
+        <w:category>
+          <w:name w:val="General"/>
+          <w:gallery w:val="placeholder"/>
+        </w:category>
+        <w:types>
+          <w:type w:val="bbPlcHdr"/>
+        </w:types>
+        <w:behaviors>
+          <w:behavior w:val="content"/>
+        </w:behaviors>
+        <w:guid w:val="{7A846E7E-6FD8-475F-BD05-5D76D2ABE1A8}"/>
+      </w:docPartPr>
+      <w:docPartBody>
+        <w:p>
+          <w:pPr>
+            <w:pStyle w:val="2D24977013E144B1B2424420B1277E29"/>
+          </w:pPr>
+          <w:r>
+            <w:rPr>
+              <w:rStyle w:val="PlaceholderText"/>
+            </w:rPr>
+            <w:t>Click or tap here to enter text.</w:t>
+          </w:r>
+        </w:p>
+      </w:docPartBody>
+    </w:docPart>
+    <w:docPart>
+      <w:docPartPr>
+        <w:name w:val="524EB1D2B6754F90A53D55EB4D357AAA"/>
+        <w:category>
+          <w:name w:val="General"/>
+          <w:gallery w:val="placeholder"/>
+        </w:category>
+        <w:types>
+          <w:type w:val="bbPlcHdr"/>
+        </w:types>
+        <w:behaviors>
+          <w:behavior w:val="content"/>
+        </w:behaviors>
+        <w:guid w:val="{D59198A7-D66D-427C-8CA2-4D3AE7C8A8F6}"/>
+      </w:docPartPr>
+      <w:docPartBody>
+        <w:p>
+          <w:pPr>
+            <w:pStyle w:val="524EB1D2B6754F90A53D55EB4D357AAA1"/>
+          </w:pPr>
+          <w:r>
+            <w:rPr>
+              <w:rFonts w:cs="Times New Roman"/>
+              <w:sz w:val="20"/>
+              <w:szCs w:val="20"/>
+            </w:rPr>
+            <w:t>AddressOffice</w:t>
+          </w:r>
+        </w:p>
+      </w:docPartBody>
+    </w:docPart>
+    <w:docPart>
+      <w:docPartPr>
+        <w:name w:val="106044608F804B119A41E87BCC843A0A"/>
+        <w:category>
+          <w:name w:val="General"/>
+          <w:gallery w:val="placeholder"/>
+        </w:category>
+        <w:types>
+          <w:type w:val="bbPlcHdr"/>
+        </w:types>
+        <w:behaviors>
+          <w:behavior w:val="content"/>
+        </w:behaviors>
+        <w:guid w:val="{1B868DC7-19D6-452C-9BB5-5B2F768921C1}"/>
+      </w:docPartPr>
+      <w:docPartBody>
+        <w:p>
+          <w:pPr>
+            <w:pStyle w:val="106044608F804B119A41E87BCC843A0A1"/>
+          </w:pPr>
+          <w:r>
+            <w:rPr>
+              <w:rFonts w:cs="Times New Roman"/>
+              <w:sz w:val="20"/>
+              <w:szCs w:val="20"/>
+            </w:rPr>
+            <w:t>AddressAgency</w:t>
+          </w:r>
+        </w:p>
+      </w:docPartBody>
+    </w:docPart>
+    <w:docPart>
+      <w:docPartPr>
+        <w:name w:val="3C11194AC35143F7B83F3E0FD2D5A02A"/>
+        <w:category>
+          <w:name w:val="General"/>
+          <w:gallery w:val="placeholder"/>
+        </w:category>
+        <w:types>
+          <w:type w:val="bbPlcHdr"/>
+        </w:types>
+        <w:behaviors>
+          <w:behavior w:val="content"/>
+        </w:behaviors>
+        <w:guid w:val="{CD9E6F3F-B001-4FE7-AB60-6F496A408E29}"/>
+      </w:docPartPr>
+      <w:docPartBody>
+        <w:p>
+          <w:pPr>
+            <w:pStyle w:val="3C11194AC35143F7B83F3E0FD2D5A02A1"/>
+          </w:pPr>
+          <w:r>
+            <w:rPr>
+              <w:rFonts w:cs="Times New Roman"/>
+              <w:sz w:val="20"/>
+              <w:szCs w:val="20"/>
+            </w:rPr>
+            <w:t>AddressLMBA</w:t>
+          </w:r>
+        </w:p>
+      </w:docPartBody>
+    </w:docPart>
+    <w:docPart>
+      <w:docPartPr>
+        <w:name w:val="ECBD07DC464B4BB99A7B90CCF9A206F6"/>
+        <w:category>
+          <w:name w:val="General"/>
+          <w:gallery w:val="placeholder"/>
+        </w:category>
+        <w:types>
+          <w:type w:val="bbPlcHdr"/>
+        </w:types>
+        <w:behaviors>
+          <w:behavior w:val="content"/>
+        </w:behaviors>
+        <w:guid w:val="{0C4A0204-F4BA-4DB3-83C2-9CB7C6223801}"/>
+      </w:docPartPr>
+      <w:docPartBody>
+        <w:p>
+          <w:pPr>
+            <w:pStyle w:val="ECBD07DC464B4BB99A7B90CCF9A206F61"/>
+          </w:pPr>
+          <w:r>
+            <w:rPr>
+              <w:rFonts w:cs="Times New Roman"/>
+              <w:sz w:val="20"/>
+              <w:szCs w:val="20"/>
+            </w:rPr>
+            <w:t>AddressName</w:t>
+          </w:r>
+        </w:p>
+      </w:docPartBody>
+    </w:docPart>
+    <w:docPart>
+      <w:docPartPr>
+        <w:name w:val="B3422A2DE8ED4EC3A6C7D602ED005408"/>
+        <w:category>
+          <w:name w:val="General"/>
+          <w:gallery w:val="placeholder"/>
+        </w:category>
+        <w:types>
+          <w:type w:val="bbPlcHdr"/>
+        </w:types>
+        <w:behaviors>
+          <w:behavior w:val="content"/>
+        </w:behaviors>
+        <w:guid w:val="{BA0BD656-58ED-4F7C-ABEE-2CACF2423EFC}"/>
+      </w:docPartPr>
+      <w:docPartBody>
+        <w:p>
+          <w:pPr>
+            <w:pStyle w:val="B3422A2DE8ED4EC3A6C7D602ED005408"/>
+          </w:pPr>
+          <w:r>
+            <w:rPr>
+              <w:rStyle w:val="PlaceholderText"/>
+            </w:rPr>
+            <w:t>Click or tap here to enter text.</w:t>
+          </w:r>
+        </w:p>
+      </w:docPartBody>
+    </w:docPart>
+    <w:docPart>
+      <w:docPartPr>
+        <w:name w:val="CF125363AD2F40A4A69E23CAC6E97C05"/>
+        <w:category>
+          <w:name w:val="General"/>
+          <w:gallery w:val="placeholder"/>
+        </w:category>
+        <w:types>
+          <w:type w:val="bbPlcHdr"/>
+        </w:types>
+        <w:behaviors>
+          <w:behavior w:val="content"/>
+        </w:behaviors>
+        <w:guid w:val="{3AB2C5CA-8330-4302-A92C-DDD5255F8363}"/>
+      </w:docPartPr>
+      <w:docPartBody>
+        <w:p>
+          <w:pPr>
+            <w:pStyle w:val="CF125363AD2F40A4A69E23CAC6E97C051"/>
+          </w:pPr>
+          <w:r>
+            <w:rPr>
+              <w:rFonts w:cs="Times New Roman"/>
+              <w:sz w:val="20"/>
+              <w:szCs w:val="20"/>
+            </w:rPr>
+            <w:t>AddressCity</w:t>
+          </w:r>
+        </w:p>
+      </w:docPartBody>
+    </w:docPart>
+    <w:docPart>
+      <w:docPartPr>
+        <w:name w:val="D662E4EE64784FE885BED988E369F631"/>
+        <w:category>
+          <w:name w:val="General"/>
+          <w:gallery w:val="placeholder"/>
+        </w:category>
+        <w:types>
+          <w:type w:val="bbPlcHdr"/>
+        </w:types>
+        <w:behaviors>
+          <w:behavior w:val="content"/>
+        </w:behaviors>
+        <w:guid w:val="{4A67E4C9-0B8B-4149-83F8-435A91049F2D}"/>
+      </w:docPartPr>
+      <w:docPartBody>
+        <w:p>
+          <w:pPr>
+            <w:pStyle w:val="D662E4EE64784FE885BED988E369F6311"/>
+          </w:pPr>
+          <w:r>
+            <w:rPr>
+              <w:rFonts w:cs="Times New Roman"/>
+              <w:sz w:val="20"/>
+              <w:szCs w:val="20"/>
+            </w:rPr>
+            <w:t>AddressPhone</w:t>
+          </w:r>
+        </w:p>
+      </w:docPartBody>
+    </w:docPart>
+    <w:docPart>
+      <w:docPartPr>
+        <w:name w:val="8B7725C0C31041E9800165E89DAFAF2C"/>
+        <w:category>
+          <w:name w:val="General"/>
+          <w:gallery w:val="placeholder"/>
+        </w:category>
+        <w:types>
+          <w:type w:val="bbPlcHdr"/>
+        </w:types>
+        <w:behaviors>
+          <w:behavior w:val="content"/>
+        </w:behaviors>
+        <w:guid w:val="{345E1701-A7D3-4BCE-9AAD-440AE56A433C}"/>
+      </w:docPartPr>
+      <w:docPartBody>
+        <w:p>
+          <w:pPr>
+            <w:pStyle w:val="8B7725C0C31041E9800165E89DAFAF2C1"/>
+          </w:pPr>
+          <w:r>
+            <w:rPr>
+              <w:rFonts w:cs="Times New Roman"/>
+              <w:sz w:val="20"/>
+              <w:szCs w:val="20"/>
+            </w:rPr>
+            <w:t>AddressEmail</w:t>
+          </w:r>
+        </w:p>
+      </w:docPartBody>
+    </w:docPart>
+    <w:docPart>
+      <w:docPartPr>
+        <w:name w:val="BA071C4D0DAE41CD80E7613325DA87C1"/>
+        <w:category>
+          <w:name w:val="General"/>
+          <w:gallery w:val="placeholder"/>
+        </w:category>
+        <w:types>
+          <w:type w:val="bbPlcHdr"/>
+        </w:types>
+        <w:behaviors>
+          <w:behavior w:val="content"/>
+        </w:behaviors>
+        <w:guid w:val="{56265E02-341F-403F-A55F-4AAAB7F25D8F}"/>
+      </w:docPartPr>
+      <w:docPartBody>
+        <w:p>
+          <w:pPr>
+            <w:pStyle w:val="BA071C4D0DAE41CD80E7613325DA87C11"/>
+          </w:pPr>
+          <w:r>
+            <w:rPr>
+              <w:rFonts w:cs="Times New Roman"/>
+              <w:sz w:val="20"/>
+              <w:szCs w:val="20"/>
+            </w:rPr>
+            <w:t>AddressOther</w:t>
           </w:r>
         </w:p>
       </w:docPartBody>
@@ -2895,6 +4148,7 @@
     <w:rsid w:val="00074D5E"/>
     <w:rsid w:val="000B49F4"/>
     <w:rsid w:val="000E0453"/>
+    <w:rsid w:val="001159A7"/>
     <w:rsid w:val="001276EA"/>
     <w:rsid w:val="00175A1A"/>
     <w:rsid w:val="00196699"/>
@@ -2936,6 +4190,7 @@
     <w:rsid w:val="006212C0"/>
     <w:rsid w:val="00632C16"/>
     <w:rsid w:val="0064260B"/>
+    <w:rsid w:val="00657B07"/>
     <w:rsid w:val="006609D3"/>
     <w:rsid w:val="00700F0F"/>
     <w:rsid w:val="007263FD"/>
@@ -2952,6 +4207,7 @@
     <w:rsid w:val="008575C3"/>
     <w:rsid w:val="00864703"/>
     <w:rsid w:val="008918C8"/>
+    <w:rsid w:val="008B5BED"/>
     <w:rsid w:val="008B7245"/>
     <w:rsid w:val="008F1729"/>
     <w:rsid w:val="00905B79"/>
@@ -2960,6 +4216,7 @@
     <w:rsid w:val="009479A3"/>
     <w:rsid w:val="00960E7A"/>
     <w:rsid w:val="00965BFA"/>
+    <w:rsid w:val="00977839"/>
     <w:rsid w:val="00991D45"/>
     <w:rsid w:val="009A318C"/>
     <w:rsid w:val="009B01DA"/>
@@ -2967,6 +4224,8 @@
     <w:rsid w:val="009F2E0A"/>
     <w:rsid w:val="00A115FD"/>
     <w:rsid w:val="00A32EBC"/>
+    <w:rsid w:val="00A47D0F"/>
+    <w:rsid w:val="00A51877"/>
     <w:rsid w:val="00A74394"/>
     <w:rsid w:val="00A74845"/>
     <w:rsid w:val="00A76EE8"/>
@@ -2978,6 +4237,8 @@
     <w:rsid w:val="00AF6BC8"/>
     <w:rsid w:val="00B161EB"/>
     <w:rsid w:val="00B246EE"/>
+    <w:rsid w:val="00B54AC0"/>
+    <w:rsid w:val="00B72304"/>
     <w:rsid w:val="00BB505C"/>
     <w:rsid w:val="00BC0983"/>
     <w:rsid w:val="00BD63A6"/>
@@ -2988,14 +4249,19 @@
     <w:rsid w:val="00C5006A"/>
     <w:rsid w:val="00C542E8"/>
     <w:rsid w:val="00CA00DB"/>
+    <w:rsid w:val="00CB0C0B"/>
     <w:rsid w:val="00CB4525"/>
+    <w:rsid w:val="00CC6230"/>
     <w:rsid w:val="00CD4644"/>
+    <w:rsid w:val="00CE024F"/>
     <w:rsid w:val="00D163A7"/>
     <w:rsid w:val="00D33AD8"/>
     <w:rsid w:val="00D34BBC"/>
     <w:rsid w:val="00D51CE3"/>
+    <w:rsid w:val="00D75131"/>
     <w:rsid w:val="00D93C4D"/>
     <w:rsid w:val="00DA1CC9"/>
+    <w:rsid w:val="00DC78E5"/>
     <w:rsid w:val="00DD0EF2"/>
     <w:rsid w:val="00DD35C6"/>
     <w:rsid w:val="00DE08D4"/>
@@ -3006,13 +4272,17 @@
     <w:rsid w:val="00E14A2A"/>
     <w:rsid w:val="00E53645"/>
     <w:rsid w:val="00E64865"/>
+    <w:rsid w:val="00E66F53"/>
     <w:rsid w:val="00E67019"/>
     <w:rsid w:val="00EA1EF4"/>
+    <w:rsid w:val="00EB3E0B"/>
     <w:rsid w:val="00EC4602"/>
     <w:rsid w:val="00ED49F3"/>
+    <w:rsid w:val="00EE75FB"/>
     <w:rsid w:val="00EF20A7"/>
     <w:rsid w:val="00F11DF1"/>
     <w:rsid w:val="00F6479F"/>
+    <w:rsid w:val="00F77AC5"/>
     <w:rsid w:val="00FA7758"/>
     <w:rsid w:val="00FC2259"/>
     <w:rsid w:val="00FD4DCB"/>
@@ -3470,10 +4740,7 @@
     <w:basedOn w:val="DefaultParagraphFont"/>
     <w:uiPriority w:val="99"/>
     <w:semiHidden/>
-    <w:rsid w:val="002F4A15"/>
-    <w:rPr>
-      <w:color w:val="808080"/>
-    </w:rPr>
+    <w:rsid w:val="00EE75FB"/>
   </w:style>
   <w:style w:type="paragraph" w:customStyle="1" w:styleId="D60CAC68A73E4BBEBED5A0BEDA628DEE">
     <w:name w:val="D60CAC68A73E4BBEBED5A0BEDA628DEE"/>
@@ -3483,9 +4750,57 @@
     <w:name w:val="C5B9ECDE78F84E2A914E49DC8E87740D"/>
     <w:rsid w:val="005F2EEC"/>
   </w:style>
-  <w:style w:type="paragraph" w:customStyle="1" w:styleId="C44BB59BDB064B8D90846BA766E001DA">
-    <w:name w:val="C44BB59BDB064B8D90846BA766E001DA"/>
-    <w:rsid w:val="004361B3"/>
+  <w:style w:type="paragraph" w:customStyle="1" w:styleId="06D85B40B6CE4D2C840027C04C0479DC">
+    <w:name w:val="06D85B40B6CE4D2C840027C04C0479DC"/>
+    <w:rsid w:val="00EE75FB"/>
+  </w:style>
+  <w:style w:type="paragraph" w:customStyle="1" w:styleId="521985503D1E4415AF9AD7F9593B49C7">
+    <w:name w:val="521985503D1E4415AF9AD7F9593B49C7"/>
+    <w:rsid w:val="00EE75FB"/>
+  </w:style>
+  <w:style w:type="paragraph" w:customStyle="1" w:styleId="61A952FDCDFB48E0B29DDA53E18A2ECF">
+    <w:name w:val="61A952FDCDFB48E0B29DDA53E18A2ECF"/>
+    <w:rsid w:val="00EE75FB"/>
+  </w:style>
+  <w:style w:type="paragraph" w:customStyle="1" w:styleId="F76C9C8787DC45029A73597E13BAAD32">
+    <w:name w:val="F76C9C8787DC45029A73597E13BAAD32"/>
+    <w:rsid w:val="00EE75FB"/>
+  </w:style>
+  <w:style w:type="paragraph" w:customStyle="1" w:styleId="BDA186354137406589A1F9B981F00DF6">
+    <w:name w:val="BDA186354137406589A1F9B981F00DF6"/>
+    <w:rsid w:val="00EE75FB"/>
+  </w:style>
+  <w:style w:type="paragraph" w:customStyle="1" w:styleId="BB5B26682959497B84E1C75A4AA77F38">
+    <w:name w:val="BB5B26682959497B84E1C75A4AA77F38"/>
+    <w:rsid w:val="00EE75FB"/>
+  </w:style>
+  <w:style w:type="paragraph" w:customStyle="1" w:styleId="86DAD9433546469F92B096369C8A461A">
+    <w:name w:val="86DAD9433546469F92B096369C8A461A"/>
+    <w:rsid w:val="00EE75FB"/>
+  </w:style>
+  <w:style w:type="paragraph" w:customStyle="1" w:styleId="B0CB95E7E1C44BDC9AC40A8A148CBF91">
+    <w:name w:val="B0CB95E7E1C44BDC9AC40A8A148CBF91"/>
+    <w:rsid w:val="00EE75FB"/>
+  </w:style>
+  <w:style w:type="paragraph" w:customStyle="1" w:styleId="20BF7676285C47BDB148E37EB71B5222">
+    <w:name w:val="20BF7676285C47BDB148E37EB71B5222"/>
+    <w:rsid w:val="00EE75FB"/>
+  </w:style>
+  <w:style w:type="paragraph" w:customStyle="1" w:styleId="399B8C51BCEA4481889C87DEE2AEB9A5">
+    <w:name w:val="399B8C51BCEA4481889C87DEE2AEB9A5"/>
+    <w:rsid w:val="00EE75FB"/>
+  </w:style>
+  <w:style w:type="paragraph" w:customStyle="1" w:styleId="2D24977013E144B1B2424420B1277E29">
+    <w:name w:val="2D24977013E144B1B2424420B1277E29"/>
+    <w:rsid w:val="00CB0C0B"/>
+  </w:style>
+  <w:style w:type="paragraph" w:customStyle="1" w:styleId="B3422A2DE8ED4EC3A6C7D602ED005408">
+    <w:name w:val="B3422A2DE8ED4EC3A6C7D602ED005408"/>
+    <w:rsid w:val="00CB0C0B"/>
+  </w:style>
+  <w:style w:type="paragraph" w:customStyle="1" w:styleId="524EB1D2B6754F90A53D55EB4D357AAA1">
+    <w:name w:val="524EB1D2B6754F90A53D55EB4D357AAA1"/>
+    <w:rsid w:val="00EE75FB"/>
     <w:pPr>
       <w:spacing w:after="0"/>
     </w:pPr>
@@ -3494,9 +4809,9 @@
       <w:sz w:val="24"/>
     </w:rPr>
   </w:style>
-  <w:style w:type="paragraph" w:customStyle="1" w:styleId="562D81866A7F4318B95320CC7802BE12">
-    <w:name w:val="562D81866A7F4318B95320CC7802BE12"/>
-    <w:rsid w:val="004361B3"/>
+  <w:style w:type="paragraph" w:customStyle="1" w:styleId="106044608F804B119A41E87BCC843A0A1">
+    <w:name w:val="106044608F804B119A41E87BCC843A0A1"/>
+    <w:rsid w:val="00EE75FB"/>
     <w:pPr>
       <w:spacing w:after="0"/>
     </w:pPr>
@@ -3505,9 +4820,97 @@
       <w:sz w:val="24"/>
     </w:rPr>
   </w:style>
+  <w:style w:type="paragraph" w:customStyle="1" w:styleId="3C11194AC35143F7B83F3E0FD2D5A02A1">
+    <w:name w:val="3C11194AC35143F7B83F3E0FD2D5A02A1"/>
+    <w:rsid w:val="00EE75FB"/>
+    <w:pPr>
+      <w:spacing w:after="0"/>
+    </w:pPr>
+    <w:rPr>
+      <w:rFonts w:ascii="Times New Roman" w:eastAsiaTheme="minorHAnsi" w:hAnsi="Times New Roman"/>
+      <w:sz w:val="24"/>
+    </w:rPr>
+  </w:style>
+  <w:style w:type="paragraph" w:customStyle="1" w:styleId="ECBD07DC464B4BB99A7B90CCF9A206F61">
+    <w:name w:val="ECBD07DC464B4BB99A7B90CCF9A206F61"/>
+    <w:rsid w:val="00EE75FB"/>
+    <w:pPr>
+      <w:spacing w:after="0"/>
+    </w:pPr>
+    <w:rPr>
+      <w:rFonts w:ascii="Times New Roman" w:eastAsiaTheme="minorHAnsi" w:hAnsi="Times New Roman"/>
+      <w:sz w:val="24"/>
+    </w:rPr>
+  </w:style>
+  <w:style w:type="paragraph" w:customStyle="1" w:styleId="CF125363AD2F40A4A69E23CAC6E97C051">
+    <w:name w:val="CF125363AD2F40A4A69E23CAC6E97C051"/>
+    <w:rsid w:val="00EE75FB"/>
+    <w:pPr>
+      <w:spacing w:after="0"/>
+    </w:pPr>
+    <w:rPr>
+      <w:rFonts w:ascii="Times New Roman" w:eastAsiaTheme="minorHAnsi" w:hAnsi="Times New Roman"/>
+      <w:sz w:val="24"/>
+    </w:rPr>
+  </w:style>
+  <w:style w:type="paragraph" w:customStyle="1" w:styleId="D662E4EE64784FE885BED988E369F6311">
+    <w:name w:val="D662E4EE64784FE885BED988E369F6311"/>
+    <w:rsid w:val="00EE75FB"/>
+    <w:pPr>
+      <w:spacing w:after="0"/>
+    </w:pPr>
+    <w:rPr>
+      <w:rFonts w:ascii="Times New Roman" w:eastAsiaTheme="minorHAnsi" w:hAnsi="Times New Roman"/>
+      <w:sz w:val="24"/>
+    </w:rPr>
+  </w:style>
+  <w:style w:type="paragraph" w:customStyle="1" w:styleId="8B7725C0C31041E9800165E89DAFAF2C1">
+    <w:name w:val="8B7725C0C31041E9800165E89DAFAF2C1"/>
+    <w:rsid w:val="00EE75FB"/>
+    <w:pPr>
+      <w:spacing w:after="0"/>
+    </w:pPr>
+    <w:rPr>
+      <w:rFonts w:ascii="Times New Roman" w:eastAsiaTheme="minorHAnsi" w:hAnsi="Times New Roman"/>
+      <w:sz w:val="24"/>
+    </w:rPr>
+  </w:style>
+  <w:style w:type="paragraph" w:customStyle="1" w:styleId="BA071C4D0DAE41CD80E7613325DA87C11">
+    <w:name w:val="BA071C4D0DAE41CD80E7613325DA87C11"/>
+    <w:rsid w:val="00EE75FB"/>
+    <w:pPr>
+      <w:spacing w:after="0"/>
+    </w:pPr>
+    <w:rPr>
+      <w:rFonts w:ascii="Times New Roman" w:eastAsiaTheme="minorHAnsi" w:hAnsi="Times New Roman"/>
+      <w:sz w:val="24"/>
+    </w:rPr>
+  </w:style>
+  <w:style w:type="paragraph" w:customStyle="1" w:styleId="C44BB59BDB064B8D90846BA766E001DA">
+    <w:name w:val="C44BB59BDB064B8D90846BA766E001DA"/>
+    <w:rsid w:val="00EE75FB"/>
+    <w:pPr>
+      <w:spacing w:after="0"/>
+    </w:pPr>
+    <w:rPr>
+      <w:rFonts w:ascii="Times New Roman" w:eastAsiaTheme="minorHAnsi" w:hAnsi="Times New Roman"/>
+      <w:sz w:val="24"/>
+    </w:rPr>
+  </w:style>
+  <w:style w:type="paragraph" w:customStyle="1" w:styleId="562D81866A7F4318B95320CC7802BE12">
+    <w:name w:val="562D81866A7F4318B95320CC7802BE12"/>
+    <w:rsid w:val="00EE75FB"/>
+    <w:pPr>
+      <w:spacing w:after="0"/>
+    </w:pPr>
+    <w:rPr>
+      <w:rFonts w:ascii="Times New Roman" w:eastAsiaTheme="minorHAnsi" w:hAnsi="Times New Roman"/>
+      <w:sz w:val="24"/>
+    </w:rPr>
+  </w:style>
   <w:style w:type="paragraph" w:customStyle="1" w:styleId="81BA274595714D0293E02C289F4649F9">
     <w:name w:val="81BA274595714D0293E02C289F4649F9"/>
-    <w:rsid w:val="004361B3"/>
+    <w:rsid w:val="00EE75FB"/>
     <w:pPr>
       <w:spacing w:after="0"/>
     </w:pPr>

</xml_diff>